<commit_message>
7 Added figure in rules оформлення
</commit_message>
<xml_diff>
--- a/оформлення.docx
+++ b/оформлення.docx
@@ -1,6 +1,6 @@
 
 <file path=word/document.xml><?xml version="1.0" encoding="utf-8"?>
-<w:document xmlns:wpc="http://schemas.microsoft.com/office/word/2010/wordprocessingCanvas" xmlns:cx="http://schemas.microsoft.com/office/drawing/2014/chartex" xmlns:cx1="http://schemas.microsoft.com/office/drawing/2015/9/8/chartex" xmlns:cx2="http://schemas.microsoft.com/office/drawing/2015/10/21/chartex" xmlns:cx3="http://schemas.microsoft.com/office/drawing/2016/5/9/chartex" xmlns:cx4="http://schemas.microsoft.com/office/drawing/2016/5/10/chartex" xmlns:cx5="http://schemas.microsoft.com/office/drawing/2016/5/11/chartex" xmlns:cx6="http://schemas.microsoft.com/office/drawing/2016/5/12/chartex" xmlns:cx7="http://schemas.microsoft.com/office/drawing/2016/5/13/chartex" xmlns:cx8="http://schemas.microsoft.com/office/drawing/2016/5/14/chartex" xmlns:mc="http://schemas.openxmlformats.org/markup-compatibility/2006" xmlns:aink="http://schemas.microsoft.com/office/drawing/2016/ink" xmlns:am3d="http://schemas.microsoft.com/office/drawing/2017/model3d" xmlns:o="urn:schemas-microsoft-com:office:office" xmlns:oel="http://schemas.microsoft.com/office/2019/extlst" xmlns:r="http://schemas.openxmlformats.org/officeDocument/2006/relationships" xmlns:m="http://schemas.openxmlformats.org/officeDocument/2006/math" xmlns:v="urn:schemas-microsoft-com:vml" xmlns:wp14="http://schemas.microsoft.com/office/word/2010/wordprocessingDrawing" xmlns:wp="http://schemas.openxmlformats.org/drawingml/2006/wordprocessingDrawing" xmlns:w10="urn:schemas-microsoft-com:office:word" xmlns:w="http://schemas.openxmlformats.org/wordprocessingml/2006/main" xmlns:w14="http://schemas.microsoft.com/office/word/2010/wordml" xmlns:w15="http://schemas.microsoft.com/office/word/2012/wordml" xmlns:w16cex="http://schemas.microsoft.com/office/word/2018/wordml/cex" xmlns:w16cid="http://schemas.microsoft.com/office/word/2016/wordml/cid" xmlns:w16="http://schemas.microsoft.com/office/word/2018/wordml" xmlns:w16du="http://schemas.microsoft.com/office/word/2023/wordml/word16du" xmlns:w16sdtdh="http://schemas.microsoft.com/office/word/2020/wordml/sdtdatahash" xmlns:w16sdtfl="http://schemas.microsoft.com/office/word/2024/wordml/sdtformatlock" xmlns:w16se="http://schemas.microsoft.com/office/word/2015/wordml/symex" xmlns:wpg="http://schemas.microsoft.com/office/word/2010/wordprocessingGroup" xmlns:wpi="http://schemas.microsoft.com/office/word/2010/wordprocessingInk" xmlns:wne="http://schemas.microsoft.com/office/word/2006/wordml" xmlns:wps="http://schemas.microsoft.com/office/word/2010/wordprocessingShape" mc:Ignorable="w14 w15 w16se w16cid w16 w16cex w16sdtdh w16sdtfl w16du wp14">
+<w:document xmlns:wpc="http://schemas.microsoft.com/office/word/2010/wordprocessingCanvas" xmlns:cx="http://schemas.microsoft.com/office/drawing/2014/chartex" xmlns:cx1="http://schemas.microsoft.com/office/drawing/2015/9/8/chartex" xmlns:cx2="http://schemas.microsoft.com/office/drawing/2015/10/21/chartex" xmlns:cx3="http://schemas.microsoft.com/office/drawing/2016/5/9/chartex" xmlns:cx4="http://schemas.microsoft.com/office/drawing/2016/5/10/chartex" xmlns:cx5="http://schemas.microsoft.com/office/drawing/2016/5/11/chartex" xmlns:cx6="http://schemas.microsoft.com/office/drawing/2016/5/12/chartex" xmlns:cx7="http://schemas.microsoft.com/office/drawing/2016/5/13/chartex" xmlns:cx8="http://schemas.microsoft.com/office/drawing/2016/5/14/chartex" xmlns:mc="http://schemas.openxmlformats.org/markup-compatibility/2006" xmlns:aink="http://schemas.microsoft.com/office/drawing/2016/ink" xmlns:am3d="http://schemas.microsoft.com/office/drawing/2017/model3d" xmlns:o="urn:schemas-microsoft-com:office:office" xmlns:oel="http://schemas.microsoft.com/office/2019/extlst" xmlns:r="http://schemas.openxmlformats.org/officeDocument/2006/relationships" xmlns:m="http://schemas.openxmlformats.org/officeDocument/2006/math" xmlns:v="urn:schemas-microsoft-com:vml" xmlns:wp14="http://schemas.microsoft.com/office/word/2010/wordprocessingDrawing" xmlns:wp="http://schemas.openxmlformats.org/drawingml/2006/wordprocessingDrawing" xmlns:w10="urn:schemas-microsoft-com:office:word" xmlns:w="http://schemas.openxmlformats.org/wordprocessingml/2006/main" xmlns:w14="http://schemas.microsoft.com/office/word/2010/wordml" xmlns:w15="http://schemas.microsoft.com/office/word/2012/wordml" xmlns:w16cex="http://schemas.microsoft.com/office/word/2018/wordml/cex" xmlns:w16cid="http://schemas.microsoft.com/office/word/2016/wordml/cid" xmlns:w16="http://schemas.microsoft.com/office/word/2018/wordml" xmlns:w16sdtdh="http://schemas.microsoft.com/office/word/2020/wordml/sdtdatahash" xmlns:w16se="http://schemas.microsoft.com/office/word/2015/wordml/symex" xmlns:wpg="http://schemas.microsoft.com/office/word/2010/wordprocessingGroup" xmlns:wpi="http://schemas.microsoft.com/office/word/2010/wordprocessingInk" xmlns:wne="http://schemas.microsoft.com/office/word/2006/wordml" xmlns:wps="http://schemas.microsoft.com/office/word/2010/wordprocessingShape" mc:Ignorable="w14 w15 w16se w16cid w16 w16cex w16sdtdh wp14">
   <w:body>
     <w:p>
       <w:pPr>
@@ -8729,7 +8729,7 @@
                 <w:noProof/>
                 <w:webHidden/>
               </w:rPr>
-              <w:t>3</w:t>
+              <w:t>4</w:t>
             </w:r>
             <w:r>
               <w:rPr>
@@ -8798,7 +8798,7 @@
                 <w:noProof/>
                 <w:webHidden/>
               </w:rPr>
-              <w:t>3</w:t>
+              <w:t>5</w:t>
             </w:r>
             <w:r>
               <w:rPr>
@@ -8867,7 +8867,7 @@
                 <w:noProof/>
                 <w:webHidden/>
               </w:rPr>
-              <w:t>3</w:t>
+              <w:t>7</w:t>
             </w:r>
             <w:r>
               <w:rPr>
@@ -8928,7 +8928,7 @@
               <w:rPr>
                 <w:webHidden/>
               </w:rPr>
-              <w:t>3</w:t>
+              <w:t>7</w:t>
             </w:r>
             <w:r>
               <w:rPr>
@@ -8988,7 +8988,7 @@
               <w:rPr>
                 <w:webHidden/>
               </w:rPr>
-              <w:t>3</w:t>
+              <w:t>8</w:t>
             </w:r>
             <w:r>
               <w:rPr>
@@ -9048,7 +9048,7 @@
               <w:rPr>
                 <w:webHidden/>
               </w:rPr>
-              <w:t>3</w:t>
+              <w:t>8</w:t>
             </w:r>
             <w:r>
               <w:rPr>
@@ -9108,7 +9108,7 @@
               <w:rPr>
                 <w:webHidden/>
               </w:rPr>
-              <w:t>3</w:t>
+              <w:t>9</w:t>
             </w:r>
             <w:r>
               <w:rPr>
@@ -9168,7 +9168,7 @@
               <w:rPr>
                 <w:webHidden/>
               </w:rPr>
-              <w:t>3</w:t>
+              <w:t>9</w:t>
             </w:r>
             <w:r>
               <w:rPr>
@@ -9228,7 +9228,7 @@
               <w:rPr>
                 <w:webHidden/>
               </w:rPr>
-              <w:t>3</w:t>
+              <w:t>9</w:t>
             </w:r>
             <w:r>
               <w:rPr>
@@ -9288,7 +9288,7 @@
               <w:rPr>
                 <w:webHidden/>
               </w:rPr>
-              <w:t>3</w:t>
+              <w:t>10</w:t>
             </w:r>
             <w:r>
               <w:rPr>
@@ -9348,7 +9348,7 @@
               <w:rPr>
                 <w:webHidden/>
               </w:rPr>
-              <w:t>3</w:t>
+              <w:t>12</w:t>
             </w:r>
             <w:r>
               <w:rPr>
@@ -9408,7 +9408,7 @@
               <w:rPr>
                 <w:webHidden/>
               </w:rPr>
-              <w:t>3</w:t>
+              <w:t>14</w:t>
             </w:r>
             <w:r>
               <w:rPr>
@@ -9468,7 +9468,7 @@
               <w:rPr>
                 <w:webHidden/>
               </w:rPr>
-              <w:t>3</w:t>
+              <w:t>14</w:t>
             </w:r>
             <w:r>
               <w:rPr>
@@ -9536,7 +9536,7 @@
                 <w:noProof/>
                 <w:webHidden/>
               </w:rPr>
-              <w:t>3</w:t>
+              <w:t>16</w:t>
             </w:r>
             <w:r>
               <w:rPr>
@@ -9597,7 +9597,7 @@
               <w:rPr>
                 <w:webHidden/>
               </w:rPr>
-              <w:t>3</w:t>
+              <w:t>16</w:t>
             </w:r>
             <w:r>
               <w:rPr>
@@ -9657,7 +9657,7 @@
               <w:rPr>
                 <w:webHidden/>
               </w:rPr>
-              <w:t>3</w:t>
+              <w:t>16</w:t>
             </w:r>
             <w:r>
               <w:rPr>
@@ -9717,7 +9717,7 @@
               <w:rPr>
                 <w:webHidden/>
               </w:rPr>
-              <w:t>3</w:t>
+              <w:t>16</w:t>
             </w:r>
             <w:r>
               <w:rPr>
@@ -9777,7 +9777,7 @@
               <w:rPr>
                 <w:webHidden/>
               </w:rPr>
-              <w:t>3</w:t>
+              <w:t>16</w:t>
             </w:r>
             <w:r>
               <w:rPr>
@@ -9837,7 +9837,7 @@
               <w:rPr>
                 <w:webHidden/>
               </w:rPr>
-              <w:t>3</w:t>
+              <w:t>16</w:t>
             </w:r>
             <w:r>
               <w:rPr>
@@ -9897,7 +9897,7 @@
               <w:rPr>
                 <w:webHidden/>
               </w:rPr>
-              <w:t>3</w:t>
+              <w:t>16</w:t>
             </w:r>
             <w:r>
               <w:rPr>
@@ -9965,7 +9965,7 @@
                 <w:noProof/>
                 <w:webHidden/>
               </w:rPr>
-              <w:t>3</w:t>
+              <w:t>17</w:t>
             </w:r>
             <w:r>
               <w:rPr>
@@ -10026,7 +10026,7 @@
               <w:rPr>
                 <w:webHidden/>
               </w:rPr>
-              <w:t>3</w:t>
+              <w:t>17</w:t>
             </w:r>
             <w:r>
               <w:rPr>
@@ -10086,7 +10086,7 @@
               <w:rPr>
                 <w:webHidden/>
               </w:rPr>
-              <w:t>3</w:t>
+              <w:t>17</w:t>
             </w:r>
             <w:r>
               <w:rPr>
@@ -10146,7 +10146,7 @@
               <w:rPr>
                 <w:webHidden/>
               </w:rPr>
-              <w:t>3</w:t>
+              <w:t>17</w:t>
             </w:r>
             <w:r>
               <w:rPr>
@@ -10206,7 +10206,7 @@
               <w:rPr>
                 <w:webHidden/>
               </w:rPr>
-              <w:t>3</w:t>
+              <w:t>17</w:t>
             </w:r>
             <w:r>
               <w:rPr>
@@ -10266,7 +10266,7 @@
               <w:rPr>
                 <w:webHidden/>
               </w:rPr>
-              <w:t>3</w:t>
+              <w:t>17</w:t>
             </w:r>
             <w:r>
               <w:rPr>
@@ -10326,7 +10326,7 @@
               <w:rPr>
                 <w:webHidden/>
               </w:rPr>
-              <w:t>3</w:t>
+              <w:t>17</w:t>
             </w:r>
             <w:r>
               <w:rPr>
@@ -10394,7 +10394,7 @@
                 <w:noProof/>
                 <w:webHidden/>
               </w:rPr>
-              <w:t>3</w:t>
+              <w:t>18</w:t>
             </w:r>
             <w:r>
               <w:rPr>
@@ -10463,7 +10463,7 @@
                 <w:noProof/>
                 <w:webHidden/>
               </w:rPr>
-              <w:t>3</w:t>
+              <w:t>19</w:t>
             </w:r>
             <w:r>
               <w:rPr>
@@ -10572,7 +10572,7 @@
                 <w:noProof/>
                 <w:webHidden/>
               </w:rPr>
-              <w:t>3</w:t>
+              <w:t>20</w:t>
             </w:r>
             <w:r>
               <w:rPr>
@@ -10681,7 +10681,7 @@
                 <w:noProof/>
                 <w:webHidden/>
               </w:rPr>
-              <w:t>3</w:t>
+              <w:t>21</w:t>
             </w:r>
             <w:r>
               <w:rPr>
@@ -12464,10 +12464,10 @@
             <v:path o:extrusionok="f" gradientshapeok="t" o:connecttype="rect"/>
             <o:lock v:ext="edit" aspectratio="t"/>
           </v:shapetype>
-          <v:shape id="_x0000_i1025" type="#_x0000_t75" style="width:83.25pt;height:36.75pt" o:ole="">
+          <v:shape id="_x0000_i1062" type="#_x0000_t75" style="width:83.25pt;height:36.75pt" o:ole="">
             <v:imagedata r:id="rId19" o:title=""/>
           </v:shape>
-          <o:OLEObject Type="Embed" ProgID="Equation.DSMT4" ShapeID="_x0000_i1025" DrawAspect="Content" ObjectID="_1852188011" r:id="rId20"/>
+          <o:OLEObject Type="Embed" ProgID="Equation.DSMT4" ShapeID="_x0000_i1062" DrawAspect="Content" ObjectID="_1852790121" r:id="rId20"/>
         </w:object>
       </w:r>
       <w:r>
@@ -12514,10 +12514,10 @@
           <w:position w:val="-38"/>
         </w:rPr>
         <w:object w:dxaOrig="900" w:dyaOrig="820" w14:anchorId="49DBDCF3">
-          <v:shape id="_x0000_i1026" type="#_x0000_t75" style="width:45pt;height:41.25pt" o:ole="">
+          <v:shape id="_x0000_i1063" type="#_x0000_t75" style="width:45pt;height:41.25pt" o:ole="">
             <v:imagedata r:id="rId21" o:title=""/>
           </v:shape>
-          <o:OLEObject Type="Embed" ProgID="Equation.DSMT4" ShapeID="_x0000_i1026" DrawAspect="Content" ObjectID="_1852188012" r:id="rId22"/>
+          <o:OLEObject Type="Embed" ProgID="Equation.DSMT4" ShapeID="_x0000_i1063" DrawAspect="Content" ObjectID="_1852790122" r:id="rId22"/>
         </w:object>
       </w:r>
       <w:r>
@@ -12811,10 +12811,10 @@
       </w:pPr>
       <w:r>
         <w:object w:dxaOrig="4515" w:dyaOrig="2100" w14:anchorId="12B822C8">
-          <v:shape id="_x0000_i1027" type="#_x0000_t75" style="width:207.75pt;height:97.5pt" o:ole="">
+          <v:shape id="_x0000_i1064" type="#_x0000_t75" style="width:207.75pt;height:97.5pt" o:ole="">
             <v:imagedata r:id="rId23" o:title=""/>
           </v:shape>
-          <o:OLEObject Type="Embed" ProgID="Word.Picture.8" ShapeID="_x0000_i1027" DrawAspect="Content" ObjectID="_1852188013" r:id="rId24"/>
+          <o:OLEObject Type="Embed" ProgID="Word.Picture.8" ShapeID="_x0000_i1064" DrawAspect="Content" ObjectID="_1852790123" r:id="rId24"/>
         </w:object>
       </w:r>
     </w:p>
@@ -12975,60 +12975,119 @@
       <w:pPr>
         <w:pStyle w:val="af"/>
       </w:pPr>
-      <w:bookmarkStart w:id="40" w:name="_Ref1630920"/>
       <w:r>
         <w:t xml:space="preserve">Рисунок </w:t>
       </w:r>
       <w:r>
+        <w:rPr>
+          <w:noProof/>
+        </w:rPr>
+        <w:fldChar w:fldCharType="begin"/>
+      </w:r>
+      <w:r>
+        <w:rPr>
+          <w:noProof/>
+        </w:rPr>
+        <w:instrText xml:space="preserve"> STYLEREF 1 \s </w:instrText>
+      </w:r>
+      <w:r>
+        <w:rPr>
+          <w:noProof/>
+        </w:rPr>
+        <w:fldChar w:fldCharType="separate"/>
+      </w:r>
+      <w:r>
+        <w:rPr>
+          <w:noProof/>
+        </w:rPr>
         <w:t>1</w:t>
       </w:r>
       <w:r>
+        <w:rPr>
+          <w:noProof/>
+        </w:rPr>
+        <w:fldChar w:fldCharType="end"/>
+      </w:r>
+      <w:r>
         <w:t>.</w:t>
       </w:r>
+      <w:r>
+        <w:fldChar w:fldCharType="begin"/>
+      </w:r>
+      <w:r>
+        <w:instrText xml:space="preserve"> SEQ Рисунок \* ARABIC </w:instrText>
+      </w:r>
+      <w:r>
+        <w:fldChar w:fldCharType="separate"/>
+      </w:r>
+      <w:r>
+        <w:rPr>
+          <w:noProof/>
+        </w:rPr>
+        <w:t>2</w:t>
+      </w:r>
+      <w:r>
+        <w:fldChar w:fldCharType="end"/>
+      </w:r>
+      <w:r>
+        <w:t xml:space="preserve"> </w:t>
+      </w:r>
+      <w:r>
+        <w:t>–</w:t>
+      </w:r>
+      <w:r>
+        <w:t xml:space="preserve"> </w:t>
+      </w:r>
+      <w:r>
+        <w:t>Н</w:t>
+      </w:r>
+      <w:r>
+        <w:t>азва графіка</w:t>
+      </w:r>
+    </w:p>
+    <w:p>
+      <w:pPr>
+        <w:rPr>
+          <w:rStyle w:val="SegoeUIEmoji121"/>
+          <w:rFonts w:asciiTheme="minorHAnsi" w:hAnsiTheme="minorHAnsi"/>
+        </w:rPr>
+      </w:pPr>
+      <w:r>
+        <w:t>На всі рисунки повинні бути посилання зазначенням слова «рисунок» і його номера. У посиланні дозволяється скорочувати слово «рисунок» (рис.).</w:t>
+      </w:r>
+      <w:r>
+        <w:rPr>
+          <w:rStyle w:val="SegoeUIEmoji121"/>
+        </w:rPr>
+        <w:t xml:space="preserve"> </w:t>
+      </w:r>
+      <w:r>
+        <w:rPr>
+          <w:rStyle w:val="SegoeUIEmoji121"/>
+        </w:rPr>
+        <w:t>⚠</w:t>
+      </w:r>
+    </w:p>
+    <w:p>
+      <w:pPr>
+        <w:rPr>
+          <w:rFonts w:asciiTheme="minorHAnsi" w:hAnsiTheme="minorHAnsi"/>
+        </w:rPr>
+      </w:pPr>
+    </w:p>
+    <w:p>
+      <w:pPr>
+        <w:pStyle w:val="Heading3"/>
+      </w:pPr>
+      <w:bookmarkStart w:id="40" w:name="_Toc124600500"/>
+      <w:bookmarkStart w:id="41" w:name="_Toc195981283"/>
+      <w:bookmarkStart w:id="42" w:name="_Toc196031156"/>
+      <w:r>
+        <w:t>Назва третього пункту третього підрозділу першого розділу (Таблиці)</w:t>
+      </w:r>
       <w:bookmarkEnd w:id="40"/>
-      <w:r>
-        <w:t>2 –</w:t>
-      </w:r>
-      <w:r>
-        <w:t xml:space="preserve"> </w:t>
-      </w:r>
-      <w:r>
-        <w:t>Н</w:t>
-      </w:r>
-      <w:r>
-        <w:t>азва графіка</w:t>
-      </w:r>
-    </w:p>
-    <w:p>
-      <w:r>
-        <w:t>На всі рисунки повинні бути посилання зазначенням слова «рисунок» і його номера. У посиланні дозволяється скорочувати слово «рисунок» (рис.).</w:t>
-      </w:r>
-      <w:r>
-        <w:rPr>
-          <w:rStyle w:val="SegoeUIEmoji121"/>
-        </w:rPr>
-        <w:t xml:space="preserve"> </w:t>
-      </w:r>
-      <w:r>
-        <w:rPr>
-          <w:rStyle w:val="SegoeUIEmoji121"/>
-        </w:rPr>
-        <w:t>⚠</w:t>
-      </w:r>
-    </w:p>
-    <w:p>
-      <w:pPr>
-        <w:pStyle w:val="Heading3"/>
-      </w:pPr>
-      <w:bookmarkStart w:id="41" w:name="_Toc124600500"/>
-      <w:bookmarkStart w:id="42" w:name="_Toc195981283"/>
-      <w:bookmarkStart w:id="43" w:name="_Toc196031156"/>
-      <w:r>
-        <w:t>Назва третього пункту третього підрозділу першого розділу (Таблиці)</w:t>
-      </w:r>
       <w:bookmarkEnd w:id="41"/>
       <w:bookmarkEnd w:id="42"/>
-      <w:bookmarkEnd w:id="43"/>
     </w:p>
     <w:p>
       <w:r>
@@ -13253,17 +13312,14 @@
     </w:p>
     <w:p>
       <w:r>
+        <w:lastRenderedPageBreak/>
         <w:t>Абзац із номером таблиці і її назвою повинен</w:t>
       </w:r>
       <w:r>
         <w:t xml:space="preserve"> оформлюватися стилем «Назва таблиці». Якщо назва</w:t>
       </w:r>
       <w:r>
-        <w:t xml:space="preserve"> таблиці не вміщується в один рядок, то другий і всі </w:t>
-      </w:r>
-      <w:r>
-        <w:lastRenderedPageBreak/>
-        <w:t xml:space="preserve">наступні рядки продовження назви повинні починатися під першою літерою її початку (див. приклад у </w:t>
+        <w:t xml:space="preserve"> таблиці не вміщується в один рядок, то другий і всі наступні рядки продовження назви повинні починатися під першою літерою її початку (див. приклад у </w:t>
       </w:r>
       <w:r>
         <w:t>СТЗВО-ХПІ-3.01-2021</w:t>
@@ -13731,146 +13787,146 @@
       <w:pPr>
         <w:pStyle w:val="Heading3"/>
       </w:pPr>
-      <w:bookmarkStart w:id="44" w:name="_Toc124600501"/>
-      <w:bookmarkStart w:id="45" w:name="_Toc195981284"/>
-      <w:bookmarkStart w:id="46" w:name="_Toc196031157"/>
+      <w:bookmarkStart w:id="43" w:name="_Toc124600501"/>
+      <w:bookmarkStart w:id="44" w:name="_Toc195981284"/>
+      <w:bookmarkStart w:id="45" w:name="_Toc196031157"/>
       <w:r>
         <w:t>Назва четвертого пункту третього підрозділу першого розділу</w:t>
       </w:r>
+      <w:bookmarkEnd w:id="43"/>
       <w:bookmarkEnd w:id="44"/>
       <w:bookmarkEnd w:id="45"/>
+    </w:p>
+    <w:p>
+      <w:pPr>
+        <w:pStyle w:val="Heading4"/>
+      </w:pPr>
+      <w:r>
+        <w:t>Назва першого підпункту четвертого пункту третього підрозділу першого розділу</w:t>
+      </w:r>
+    </w:p>
+    <w:p>
+      <w:r>
+        <w:rPr>
+          <w:highlight w:val="magenta"/>
+        </w:rPr>
+        <w:t>Текст підпункту.</w:t>
+      </w:r>
+    </w:p>
+    <w:p>
+      <w:r>
+        <w:rPr>
+          <w:rStyle w:val="SegoeUIEmoji121"/>
+        </w:rPr>
+        <w:t>⚠</w:t>
+      </w:r>
+      <w:r>
+        <w:t xml:space="preserve">Назви підпунктів пояснювальної записки оформлюються стилем </w:t>
+      </w:r>
+      <w:r>
+        <w:t>«</w:t>
+      </w:r>
+      <w:r>
+        <w:t>Заголовок 4»</w:t>
+      </w:r>
+      <w:r>
+        <w:t>.</w:t>
+      </w:r>
+      <w:r>
+        <w:rPr>
+          <w:rStyle w:val="SegoeUIEmoji121"/>
+        </w:rPr>
+        <w:t xml:space="preserve"> </w:t>
+      </w:r>
+      <w:r>
+        <w:rPr>
+          <w:rStyle w:val="SegoeUIEmoji121"/>
+        </w:rPr>
+        <w:t>⚠</w:t>
+      </w:r>
+    </w:p>
+    <w:p>
+      <w:pPr>
+        <w:pStyle w:val="Heading4"/>
+      </w:pPr>
+      <w:r>
+        <w:t>Назва другого підпункту четвертого пункту третього підрозділу першого розділу</w:t>
+      </w:r>
+    </w:p>
+    <w:p>
+      <w:r>
+        <w:rPr>
+          <w:highlight w:val="magenta"/>
+        </w:rPr>
+        <w:t>Текст підпункту.</w:t>
+      </w:r>
+      <w:r>
+        <w:t xml:space="preserve"> </w:t>
+      </w:r>
+    </w:p>
+    <w:p>
+      <w:pPr>
+        <w:pStyle w:val="aff1"/>
+      </w:pPr>
+      <w:r>
+        <w:rPr>
+          <w:rStyle w:val="SegoeUIEmoji121"/>
+        </w:rPr>
+        <w:t>⚠</w:t>
+      </w:r>
+      <w:r>
+        <w:rPr>
+          <w:highlight w:val="red"/>
+        </w:rPr>
+        <w:t>Увага.</w:t>
+      </w:r>
+      <w:r>
+        <w:t xml:space="preserve"> Абзац перед назвою підрозділу оформлюється стилем «</w:t>
+      </w:r>
+      <w:r>
+        <w:t>Звичайний (останній абзац розділу/підрозділу)</w:t>
+      </w:r>
+      <w:r>
+        <w:t>».</w:t>
+      </w:r>
+      <w:r>
+        <w:rPr>
+          <w:rStyle w:val="SegoeUIEmoji121"/>
+        </w:rPr>
+        <w:t xml:space="preserve"> </w:t>
+      </w:r>
+      <w:r>
+        <w:rPr>
+          <w:rStyle w:val="SegoeUIEmoji121"/>
+        </w:rPr>
+        <w:t>⚠</w:t>
+      </w:r>
+    </w:p>
+    <w:p>
+      <w:pPr>
+        <w:pStyle w:val="Heading2"/>
+      </w:pPr>
+      <w:bookmarkStart w:id="46" w:name="_Toc124600502"/>
+      <w:bookmarkStart w:id="47" w:name="_Toc195981285"/>
+      <w:bookmarkStart w:id="48" w:name="_Toc196031158"/>
+      <w:r>
+        <w:t>Мета</w:t>
+      </w:r>
+      <w:r>
+        <w:t xml:space="preserve"> і за</w:t>
+      </w:r>
+      <w:r>
+        <w:t>д</w:t>
+      </w:r>
+      <w:r>
+        <w:t>ачі</w:t>
+      </w:r>
+      <w:r>
+        <w:t xml:space="preserve"> роботи</w:t>
+      </w:r>
       <w:bookmarkEnd w:id="46"/>
-    </w:p>
-    <w:p>
-      <w:pPr>
-        <w:pStyle w:val="Heading4"/>
-      </w:pPr>
-      <w:r>
-        <w:t>Назва першого підпункту четвертого пункту третього підрозділу першого розділу</w:t>
-      </w:r>
-    </w:p>
-    <w:p>
-      <w:r>
-        <w:rPr>
-          <w:highlight w:val="magenta"/>
-        </w:rPr>
-        <w:t>Текст підпункту.</w:t>
-      </w:r>
-    </w:p>
-    <w:p>
-      <w:r>
-        <w:rPr>
-          <w:rStyle w:val="SegoeUIEmoji121"/>
-        </w:rPr>
-        <w:t>⚠</w:t>
-      </w:r>
-      <w:r>
-        <w:t xml:space="preserve">Назви підпунктів пояснювальної записки оформлюються стилем </w:t>
-      </w:r>
-      <w:r>
-        <w:t>«</w:t>
-      </w:r>
-      <w:r>
-        <w:t>Заголовок 4»</w:t>
-      </w:r>
-      <w:r>
-        <w:t>.</w:t>
-      </w:r>
-      <w:r>
-        <w:rPr>
-          <w:rStyle w:val="SegoeUIEmoji121"/>
-        </w:rPr>
-        <w:t xml:space="preserve"> </w:t>
-      </w:r>
-      <w:r>
-        <w:rPr>
-          <w:rStyle w:val="SegoeUIEmoji121"/>
-        </w:rPr>
-        <w:t>⚠</w:t>
-      </w:r>
-    </w:p>
-    <w:p>
-      <w:pPr>
-        <w:pStyle w:val="Heading4"/>
-      </w:pPr>
-      <w:r>
-        <w:t>Назва другого підпункту четвертого пункту третього підрозділу першого розділу</w:t>
-      </w:r>
-    </w:p>
-    <w:p>
-      <w:r>
-        <w:rPr>
-          <w:highlight w:val="magenta"/>
-        </w:rPr>
-        <w:t>Текст підпункту.</w:t>
-      </w:r>
-      <w:r>
-        <w:t xml:space="preserve"> </w:t>
-      </w:r>
-    </w:p>
-    <w:p>
-      <w:pPr>
-        <w:pStyle w:val="aff1"/>
-      </w:pPr>
-      <w:r>
-        <w:rPr>
-          <w:rStyle w:val="SegoeUIEmoji121"/>
-        </w:rPr>
-        <w:t>⚠</w:t>
-      </w:r>
-      <w:r>
-        <w:rPr>
-          <w:highlight w:val="red"/>
-        </w:rPr>
-        <w:t>Увага.</w:t>
-      </w:r>
-      <w:r>
-        <w:t xml:space="preserve"> Абзац перед назвою підрозділу оформлюється стилем «</w:t>
-      </w:r>
-      <w:r>
-        <w:t>Звичайний (останній абзац розділу/підрозділу)</w:t>
-      </w:r>
-      <w:r>
-        <w:t>».</w:t>
-      </w:r>
-      <w:r>
-        <w:rPr>
-          <w:rStyle w:val="SegoeUIEmoji121"/>
-        </w:rPr>
-        <w:t xml:space="preserve"> </w:t>
-      </w:r>
-      <w:r>
-        <w:rPr>
-          <w:rStyle w:val="SegoeUIEmoji121"/>
-        </w:rPr>
-        <w:t>⚠</w:t>
-      </w:r>
-    </w:p>
-    <w:p>
-      <w:pPr>
-        <w:pStyle w:val="Heading2"/>
-      </w:pPr>
-      <w:bookmarkStart w:id="47" w:name="_Toc124600502"/>
-      <w:bookmarkStart w:id="48" w:name="_Toc195981285"/>
-      <w:bookmarkStart w:id="49" w:name="_Toc196031158"/>
-      <w:r>
-        <w:t>Мета</w:t>
-      </w:r>
-      <w:r>
-        <w:t xml:space="preserve"> і за</w:t>
-      </w:r>
-      <w:r>
-        <w:t>д</w:t>
-      </w:r>
-      <w:r>
-        <w:t>ачі</w:t>
-      </w:r>
-      <w:r>
-        <w:t xml:space="preserve"> роботи</w:t>
-      </w:r>
       <w:bookmarkEnd w:id="47"/>
       <w:bookmarkEnd w:id="48"/>
-      <w:bookmarkEnd w:id="49"/>
     </w:p>
     <w:p>
       <w:r>
@@ -13986,7 +14042,7 @@
         </w:numPr>
         <w:ind w:left="0" w:firstLine="709"/>
       </w:pPr>
-      <w:bookmarkStart w:id="50" w:name="_Hlk195728473"/>
+      <w:bookmarkStart w:id="49" w:name="_Hlk195728473"/>
       <w:r>
         <w:t>задача 1;</w:t>
       </w:r>
@@ -14006,7 +14062,7 @@
       <w:r>
         <w:t>тощо.</w:t>
       </w:r>
-      <w:bookmarkEnd w:id="50"/>
+      <w:bookmarkEnd w:id="49"/>
     </w:p>
     <w:p>
       <w:r>
@@ -14023,255 +14079,255 @@
       <w:pPr>
         <w:pStyle w:val="Heading1"/>
       </w:pPr>
-      <w:bookmarkStart w:id="51" w:name="_Toc124600503"/>
-      <w:bookmarkStart w:id="52" w:name="_Toc195981286"/>
-      <w:bookmarkStart w:id="53" w:name="_Toc196031159"/>
+      <w:bookmarkStart w:id="50" w:name="_Toc124600503"/>
+      <w:bookmarkStart w:id="51" w:name="_Toc195981286"/>
+      <w:bookmarkStart w:id="52" w:name="_Toc196031159"/>
       <w:bookmarkEnd w:id="34"/>
       <w:r>
         <w:lastRenderedPageBreak/>
         <w:t>Назва другого розділу</w:t>
       </w:r>
+      <w:bookmarkEnd w:id="50"/>
       <w:bookmarkEnd w:id="51"/>
       <w:bookmarkEnd w:id="52"/>
+    </w:p>
+    <w:p>
+      <w:pPr>
+        <w:pStyle w:val="Heading2"/>
+      </w:pPr>
+      <w:bookmarkStart w:id="53" w:name="_Toc124600504"/>
+      <w:bookmarkStart w:id="54" w:name="_Toc195981287"/>
+      <w:bookmarkStart w:id="55" w:name="_Toc196031160"/>
+      <w:r>
+        <w:t xml:space="preserve">Назва </w:t>
+      </w:r>
+      <w:r>
+        <w:t>першого</w:t>
+      </w:r>
+      <w:r>
+        <w:t xml:space="preserve"> підрозділу другого розділу</w:t>
+      </w:r>
       <w:bookmarkEnd w:id="53"/>
-    </w:p>
-    <w:p>
-      <w:pPr>
-        <w:pStyle w:val="Heading2"/>
-      </w:pPr>
-      <w:bookmarkStart w:id="54" w:name="_Toc124600504"/>
-      <w:bookmarkStart w:id="55" w:name="_Toc195981287"/>
-      <w:bookmarkStart w:id="56" w:name="_Toc196031160"/>
-      <w:r>
-        <w:t xml:space="preserve">Назва </w:t>
-      </w:r>
-      <w:r>
-        <w:t>першого</w:t>
-      </w:r>
-      <w:r>
-        <w:t xml:space="preserve"> підрозділу другого розділу</w:t>
-      </w:r>
       <w:bookmarkEnd w:id="54"/>
       <w:bookmarkEnd w:id="55"/>
+    </w:p>
+    <w:p>
+      <w:pPr>
+        <w:pStyle w:val="Heading3"/>
+      </w:pPr>
+      <w:bookmarkStart w:id="56" w:name="_Toc124600505"/>
+      <w:bookmarkStart w:id="57" w:name="_Toc195981288"/>
+      <w:bookmarkStart w:id="58" w:name="_Toc196031161"/>
+      <w:r>
+        <w:t>Назва першого пункту першого підрозділу другого розділу</w:t>
+      </w:r>
       <w:bookmarkEnd w:id="56"/>
-    </w:p>
-    <w:p>
-      <w:pPr>
-        <w:pStyle w:val="Heading3"/>
-      </w:pPr>
-      <w:bookmarkStart w:id="57" w:name="_Toc124600505"/>
-      <w:bookmarkStart w:id="58" w:name="_Toc195981288"/>
-      <w:bookmarkStart w:id="59" w:name="_Toc196031161"/>
-      <w:r>
-        <w:t>Назва першого пункту першого підрозділу другого розділу</w:t>
-      </w:r>
       <w:bookmarkEnd w:id="57"/>
       <w:bookmarkEnd w:id="58"/>
+    </w:p>
+    <w:p>
+      <w:r>
+        <w:rPr>
+          <w:highlight w:val="magenta"/>
+        </w:rPr>
+        <w:t>Текст першого пункту першого підрозділу другого розділу.</w:t>
+      </w:r>
+    </w:p>
+    <w:p>
+      <w:r>
+        <w:rPr>
+          <w:rStyle w:val="SegoeUIEmoji121"/>
+        </w:rPr>
+        <w:t>⚠</w:t>
+      </w:r>
+      <w:r>
+        <w:t xml:space="preserve">Якщо </w:t>
+      </w:r>
+      <w:r>
+        <w:t>в</w:t>
+      </w:r>
+      <w:r>
+        <w:t xml:space="preserve"> тексті або </w:t>
+      </w:r>
+      <w:r>
+        <w:t xml:space="preserve">в </w:t>
+      </w:r>
+      <w:r>
+        <w:t>таблиці необхідно пояснити окремі дані, то їх допускається оформляти виносками</w:t>
+      </w:r>
+      <w:r>
+        <w:rPr>
+          <w:rStyle w:val="FootnoteReference"/>
+        </w:rPr>
+        <w:footnoteReference w:id="2"/>
+      </w:r>
+      <w:r>
+        <w:t xml:space="preserve">, які додаються з допомогою </w:t>
+      </w:r>
+      <w:r>
+        <w:t>інструменту</w:t>
+      </w:r>
+      <w:r>
+        <w:t xml:space="preserve"> </w:t>
+      </w:r>
+      <w:r>
+        <w:t>«</w:t>
+      </w:r>
+      <w:r>
+        <w:t>Посилання</w:t>
+      </w:r>
+      <w:r>
+        <w:t>»►</w:t>
+      </w:r>
+      <w:r>
+        <w:t>«</w:t>
+      </w:r>
+      <w:r>
+        <w:t>Вставит</w:t>
+      </w:r>
+      <w:r>
+        <w:t>и</w:t>
+      </w:r>
+      <w:r>
+        <w:t xml:space="preserve"> </w:t>
+      </w:r>
+      <w:r>
+        <w:t>ви</w:t>
+      </w:r>
+      <w:r>
+        <w:t>носку</w:t>
+      </w:r>
+      <w:r>
+        <w:t>»</w:t>
+      </w:r>
+      <w:r>
+        <w:t>.</w:t>
+      </w:r>
+      <w:r>
+        <w:rPr>
+          <w:rStyle w:val="SegoeUIEmoji121"/>
+        </w:rPr>
+        <w:t xml:space="preserve"> </w:t>
+      </w:r>
+      <w:r>
+        <w:rPr>
+          <w:rStyle w:val="SegoeUIEmoji121"/>
+        </w:rPr>
+        <w:t>⚠</w:t>
+      </w:r>
+    </w:p>
+    <w:p>
+      <w:pPr>
+        <w:pStyle w:val="Heading3"/>
+      </w:pPr>
+      <w:bookmarkStart w:id="59" w:name="_Toc124600506"/>
+      <w:bookmarkStart w:id="60" w:name="_Toc195981289"/>
+      <w:bookmarkStart w:id="61" w:name="_Toc196031162"/>
+      <w:r>
+        <w:t>Назва другого пункту першого підрозділу другого розділу</w:t>
+      </w:r>
       <w:bookmarkEnd w:id="59"/>
-    </w:p>
-    <w:p>
-      <w:r>
-        <w:rPr>
-          <w:highlight w:val="magenta"/>
-        </w:rPr>
-        <w:t>Текст першого пункту першого підрозділу другого розділу.</w:t>
-      </w:r>
-    </w:p>
-    <w:p>
-      <w:r>
-        <w:rPr>
-          <w:rStyle w:val="SegoeUIEmoji121"/>
-        </w:rPr>
-        <w:t>⚠</w:t>
-      </w:r>
-      <w:r>
-        <w:t xml:space="preserve">Якщо </w:t>
-      </w:r>
-      <w:r>
-        <w:t>в</w:t>
-      </w:r>
-      <w:r>
-        <w:t xml:space="preserve"> тексті або </w:t>
-      </w:r>
-      <w:r>
-        <w:t xml:space="preserve">в </w:t>
-      </w:r>
-      <w:r>
-        <w:t>таблиці необхідно пояснити окремі дані, то їх допускається оформляти виносками</w:t>
-      </w:r>
-      <w:r>
-        <w:rPr>
-          <w:rStyle w:val="FootnoteReference"/>
-        </w:rPr>
-        <w:footnoteReference w:id="2"/>
-      </w:r>
-      <w:r>
-        <w:t xml:space="preserve">, які додаються з допомогою </w:t>
-      </w:r>
-      <w:r>
-        <w:t>інструменту</w:t>
-      </w:r>
-      <w:r>
-        <w:t xml:space="preserve"> </w:t>
-      </w:r>
-      <w:r>
-        <w:t>«</w:t>
-      </w:r>
-      <w:r>
-        <w:t>Посилання</w:t>
-      </w:r>
-      <w:r>
-        <w:t>»►</w:t>
-      </w:r>
-      <w:r>
-        <w:t>«</w:t>
-      </w:r>
-      <w:r>
-        <w:t>Вставит</w:t>
-      </w:r>
-      <w:r>
-        <w:t>и</w:t>
-      </w:r>
-      <w:r>
-        <w:t xml:space="preserve"> </w:t>
-      </w:r>
-      <w:r>
-        <w:t>ви</w:t>
-      </w:r>
-      <w:r>
-        <w:t>носку</w:t>
-      </w:r>
-      <w:r>
-        <w:t>»</w:t>
-      </w:r>
-      <w:r>
-        <w:t>.</w:t>
-      </w:r>
-      <w:r>
-        <w:rPr>
-          <w:rStyle w:val="SegoeUIEmoji121"/>
-        </w:rPr>
-        <w:t xml:space="preserve"> </w:t>
-      </w:r>
-      <w:r>
-        <w:rPr>
-          <w:rStyle w:val="SegoeUIEmoji121"/>
-        </w:rPr>
-        <w:t>⚠</w:t>
-      </w:r>
-    </w:p>
-    <w:p>
-      <w:pPr>
-        <w:pStyle w:val="Heading3"/>
-      </w:pPr>
-      <w:bookmarkStart w:id="60" w:name="_Toc124600506"/>
-      <w:bookmarkStart w:id="61" w:name="_Toc195981289"/>
-      <w:bookmarkStart w:id="62" w:name="_Toc196031162"/>
-      <w:r>
-        <w:t>Назва другого пункту першого підрозділу другого розділу</w:t>
-      </w:r>
       <w:bookmarkEnd w:id="60"/>
       <w:bookmarkEnd w:id="61"/>
+    </w:p>
+    <w:p>
+      <w:r>
+        <w:rPr>
+          <w:highlight w:val="magenta"/>
+        </w:rPr>
+        <w:t>Текст першого пункту першого підрозділу другого розділу.</w:t>
+      </w:r>
+      <w:r>
+        <w:t xml:space="preserve"> </w:t>
+      </w:r>
+    </w:p>
+    <w:p>
+      <w:pPr>
+        <w:pStyle w:val="aff1"/>
+      </w:pPr>
+      <w:r>
+        <w:rPr>
+          <w:rStyle w:val="SegoeUIEmoji121"/>
+        </w:rPr>
+        <w:t>⚠</w:t>
+      </w:r>
+      <w:r>
+        <w:rPr>
+          <w:highlight w:val="red"/>
+        </w:rPr>
+        <w:t>Увага.</w:t>
+      </w:r>
+      <w:r>
+        <w:t xml:space="preserve"> Абзац перед назвою підрозділу оформлюється стилем «</w:t>
+      </w:r>
+      <w:r>
+        <w:t>Звичайний (останній абзац розділу/підрозділу)</w:t>
+      </w:r>
+      <w:r>
+        <w:t>».</w:t>
+      </w:r>
+      <w:r>
+        <w:rPr>
+          <w:rStyle w:val="SegoeUIEmoji121"/>
+        </w:rPr>
+        <w:t xml:space="preserve"> </w:t>
+      </w:r>
+      <w:r>
+        <w:rPr>
+          <w:rStyle w:val="SegoeUIEmoji121"/>
+        </w:rPr>
+        <w:t>⚠</w:t>
+      </w:r>
+    </w:p>
+    <w:p>
+      <w:pPr>
+        <w:pStyle w:val="Heading2"/>
+      </w:pPr>
+      <w:bookmarkStart w:id="62" w:name="_Toc124600507"/>
+      <w:bookmarkStart w:id="63" w:name="_Toc195981290"/>
+      <w:bookmarkStart w:id="64" w:name="_Toc196031163"/>
+      <w:r>
+        <w:t>Назва другого підрозділу другого розділу</w:t>
+      </w:r>
       <w:bookmarkEnd w:id="62"/>
-    </w:p>
-    <w:p>
-      <w:r>
-        <w:rPr>
-          <w:highlight w:val="magenta"/>
-        </w:rPr>
-        <w:t>Текст першого пункту першого підрозділу другого розділу.</w:t>
-      </w:r>
-      <w:r>
-        <w:t xml:space="preserve"> </w:t>
-      </w:r>
-    </w:p>
-    <w:p>
-      <w:pPr>
-        <w:pStyle w:val="aff1"/>
-      </w:pPr>
-      <w:r>
-        <w:rPr>
-          <w:rStyle w:val="SegoeUIEmoji121"/>
-        </w:rPr>
-        <w:t>⚠</w:t>
-      </w:r>
-      <w:r>
-        <w:rPr>
-          <w:highlight w:val="red"/>
-        </w:rPr>
-        <w:t>Увага.</w:t>
-      </w:r>
-      <w:r>
-        <w:t xml:space="preserve"> Абзац перед назвою підрозділу оформлюється стилем «</w:t>
-      </w:r>
-      <w:r>
-        <w:t>Звичайний (останній абзац розділу/підрозділу)</w:t>
-      </w:r>
-      <w:r>
-        <w:t>».</w:t>
-      </w:r>
-      <w:r>
-        <w:rPr>
-          <w:rStyle w:val="SegoeUIEmoji121"/>
-        </w:rPr>
-        <w:t xml:space="preserve"> </w:t>
-      </w:r>
-      <w:r>
-        <w:rPr>
-          <w:rStyle w:val="SegoeUIEmoji121"/>
-        </w:rPr>
-        <w:t>⚠</w:t>
-      </w:r>
-    </w:p>
-    <w:p>
-      <w:pPr>
-        <w:pStyle w:val="Heading2"/>
-      </w:pPr>
-      <w:bookmarkStart w:id="63" w:name="_Toc124600507"/>
-      <w:bookmarkStart w:id="64" w:name="_Toc195981290"/>
-      <w:bookmarkStart w:id="65" w:name="_Toc196031163"/>
-      <w:r>
-        <w:t>Назва другого підрозділу другого розділу</w:t>
-      </w:r>
       <w:bookmarkEnd w:id="63"/>
       <w:bookmarkEnd w:id="64"/>
+    </w:p>
+    <w:p>
+      <w:pPr>
+        <w:pStyle w:val="Heading3"/>
+      </w:pPr>
+      <w:bookmarkStart w:id="65" w:name="_Toc124600508"/>
+      <w:bookmarkStart w:id="66" w:name="_Toc195981291"/>
+      <w:bookmarkStart w:id="67" w:name="_Toc196031164"/>
+      <w:r>
+        <w:t>Назва першого пункту другого підрозділу другого розділу</w:t>
+      </w:r>
       <w:bookmarkEnd w:id="65"/>
-    </w:p>
-    <w:p>
-      <w:pPr>
-        <w:pStyle w:val="Heading3"/>
-      </w:pPr>
-      <w:bookmarkStart w:id="66" w:name="_Toc124600508"/>
-      <w:bookmarkStart w:id="67" w:name="_Toc195981291"/>
-      <w:bookmarkStart w:id="68" w:name="_Toc196031164"/>
-      <w:r>
-        <w:t>Назва першого пункту другого підрозділу другого розділу</w:t>
-      </w:r>
       <w:bookmarkEnd w:id="66"/>
       <w:bookmarkEnd w:id="67"/>
+    </w:p>
+    <w:p>
+      <w:r>
+        <w:rPr>
+          <w:highlight w:val="magenta"/>
+        </w:rPr>
+        <w:t>Текст першого пункту другого підрозділу другого розділу.</w:t>
+      </w:r>
+    </w:p>
+    <w:p>
+      <w:pPr>
+        <w:pStyle w:val="Heading3"/>
+      </w:pPr>
+      <w:bookmarkStart w:id="68" w:name="_Toc124600509"/>
+      <w:bookmarkStart w:id="69" w:name="_Toc195981292"/>
+      <w:bookmarkStart w:id="70" w:name="_Toc196031165"/>
+      <w:r>
+        <w:t>Назва другого пункту другого підрозділу другого розділу</w:t>
+      </w:r>
       <w:bookmarkEnd w:id="68"/>
-    </w:p>
-    <w:p>
-      <w:r>
-        <w:rPr>
-          <w:highlight w:val="magenta"/>
-        </w:rPr>
-        <w:t>Текст першого пункту другого підрозділу другого розділу.</w:t>
-      </w:r>
-    </w:p>
-    <w:p>
-      <w:pPr>
-        <w:pStyle w:val="Heading3"/>
-      </w:pPr>
-      <w:bookmarkStart w:id="69" w:name="_Toc124600509"/>
-      <w:bookmarkStart w:id="70" w:name="_Toc195981292"/>
-      <w:bookmarkStart w:id="71" w:name="_Toc196031165"/>
-      <w:r>
-        <w:t>Назва другого пункту другого підрозділу другого розділу</w:t>
-      </w:r>
       <w:bookmarkEnd w:id="69"/>
       <w:bookmarkEnd w:id="70"/>
-      <w:bookmarkEnd w:id="71"/>
     </w:p>
     <w:p>
       <w:r>
@@ -14285,9 +14341,9 @@
       <w:pPr>
         <w:pStyle w:val="Heading1"/>
       </w:pPr>
-      <w:bookmarkStart w:id="72" w:name="_Toc124600510"/>
-      <w:bookmarkStart w:id="73" w:name="_Toc195981293"/>
-      <w:bookmarkStart w:id="74" w:name="_Toc196031166"/>
+      <w:bookmarkStart w:id="71" w:name="_Toc124600510"/>
+      <w:bookmarkStart w:id="72" w:name="_Toc195981293"/>
+      <w:bookmarkStart w:id="73" w:name="_Toc196031166"/>
       <w:r>
         <w:lastRenderedPageBreak/>
         <w:t xml:space="preserve">Назва </w:t>
@@ -14298,174 +14354,174 @@
       <w:r>
         <w:t xml:space="preserve"> розділу</w:t>
       </w:r>
+      <w:bookmarkEnd w:id="71"/>
       <w:bookmarkEnd w:id="72"/>
       <w:bookmarkEnd w:id="73"/>
+      <w:r>
+        <w:t xml:space="preserve"> </w:t>
+      </w:r>
+    </w:p>
+    <w:p>
+      <w:pPr>
+        <w:pStyle w:val="Heading2"/>
+      </w:pPr>
+      <w:bookmarkStart w:id="74" w:name="_Toc124600511"/>
+      <w:bookmarkStart w:id="75" w:name="_Toc195981294"/>
+      <w:bookmarkStart w:id="76" w:name="_Toc196031167"/>
+      <w:r>
+        <w:t>Назва першого підрозділу третього розділу</w:t>
+      </w:r>
       <w:bookmarkEnd w:id="74"/>
-      <w:r>
-        <w:t xml:space="preserve"> </w:t>
-      </w:r>
-    </w:p>
-    <w:p>
-      <w:pPr>
-        <w:pStyle w:val="Heading2"/>
-      </w:pPr>
-      <w:bookmarkStart w:id="75" w:name="_Toc124600511"/>
-      <w:bookmarkStart w:id="76" w:name="_Toc195981294"/>
-      <w:bookmarkStart w:id="77" w:name="_Toc196031167"/>
-      <w:r>
-        <w:t>Назва першого підрозділу третього розділу</w:t>
-      </w:r>
       <w:bookmarkEnd w:id="75"/>
       <w:bookmarkEnd w:id="76"/>
+    </w:p>
+    <w:p>
+      <w:r>
+        <w:rPr>
+          <w:highlight w:val="magenta"/>
+        </w:rPr>
+        <w:t>Текст першого підрозділу третього розділу.</w:t>
+      </w:r>
+    </w:p>
+    <w:p>
+      <w:pPr>
+        <w:pStyle w:val="Heading3"/>
+      </w:pPr>
+      <w:bookmarkStart w:id="77" w:name="_Toc124600512"/>
+      <w:bookmarkStart w:id="78" w:name="_Toc195981295"/>
+      <w:bookmarkStart w:id="79" w:name="_Toc196031168"/>
+      <w:r>
+        <w:t>Назва першого пункту першого підрозділу третього розділу</w:t>
+      </w:r>
       <w:bookmarkEnd w:id="77"/>
-    </w:p>
-    <w:p>
-      <w:r>
-        <w:rPr>
-          <w:highlight w:val="magenta"/>
-        </w:rPr>
-        <w:t>Текст першого підрозділу третього розділу.</w:t>
-      </w:r>
-    </w:p>
-    <w:p>
-      <w:pPr>
-        <w:pStyle w:val="Heading3"/>
-      </w:pPr>
-      <w:bookmarkStart w:id="78" w:name="_Toc124600512"/>
-      <w:bookmarkStart w:id="79" w:name="_Toc195981295"/>
-      <w:bookmarkStart w:id="80" w:name="_Toc196031168"/>
-      <w:r>
-        <w:t>Назва першого пункту першого підрозділу третього розділу</w:t>
-      </w:r>
       <w:bookmarkEnd w:id="78"/>
       <w:bookmarkEnd w:id="79"/>
+    </w:p>
+    <w:p>
+      <w:r>
+        <w:rPr>
+          <w:highlight w:val="magenta"/>
+        </w:rPr>
+        <w:t>Текст першого пункту першого підрозділу третього розділу.</w:t>
+      </w:r>
+    </w:p>
+    <w:p>
+      <w:pPr>
+        <w:pStyle w:val="Heading3"/>
+      </w:pPr>
+      <w:bookmarkStart w:id="80" w:name="_Toc124600513"/>
+      <w:bookmarkStart w:id="81" w:name="_Toc195981296"/>
+      <w:bookmarkStart w:id="82" w:name="_Toc196031169"/>
+      <w:r>
+        <w:t>Назва другого пункту першого підрозділу третього розділу</w:t>
+      </w:r>
       <w:bookmarkEnd w:id="80"/>
-    </w:p>
-    <w:p>
-      <w:r>
-        <w:rPr>
-          <w:highlight w:val="magenta"/>
-        </w:rPr>
-        <w:t>Текст першого пункту першого підрозділу третього розділу.</w:t>
-      </w:r>
-    </w:p>
-    <w:p>
-      <w:pPr>
-        <w:pStyle w:val="Heading3"/>
-      </w:pPr>
-      <w:bookmarkStart w:id="81" w:name="_Toc124600513"/>
-      <w:bookmarkStart w:id="82" w:name="_Toc195981296"/>
-      <w:bookmarkStart w:id="83" w:name="_Toc196031169"/>
-      <w:r>
-        <w:t>Назва другого пункту першого підрозділу третього розділу</w:t>
-      </w:r>
       <w:bookmarkEnd w:id="81"/>
       <w:bookmarkEnd w:id="82"/>
+    </w:p>
+    <w:p>
+      <w:r>
+        <w:rPr>
+          <w:highlight w:val="magenta"/>
+        </w:rPr>
+        <w:t>Текст першого пункту першого підрозділу третього розділу.</w:t>
+      </w:r>
+    </w:p>
+    <w:p>
+      <w:pPr>
+        <w:pStyle w:val="aff1"/>
+      </w:pPr>
+      <w:r>
+        <w:rPr>
+          <w:rStyle w:val="SegoeUIEmoji121"/>
+        </w:rPr>
+        <w:t>⚠</w:t>
+      </w:r>
+      <w:r>
+        <w:rPr>
+          <w:highlight w:val="red"/>
+        </w:rPr>
+        <w:t>Увага.</w:t>
+      </w:r>
+      <w:r>
+        <w:t xml:space="preserve"> Абзац перед назвою підрозділу оформлюється стилем «</w:t>
+      </w:r>
+      <w:r>
+        <w:t>Звичайний (останній абзац розділу/підрозділу)</w:t>
+      </w:r>
+      <w:r>
+        <w:t>».</w:t>
+      </w:r>
+      <w:r>
+        <w:rPr>
+          <w:rStyle w:val="SegoeUIEmoji121"/>
+        </w:rPr>
+        <w:t xml:space="preserve"> </w:t>
+      </w:r>
+      <w:r>
+        <w:rPr>
+          <w:rStyle w:val="SegoeUIEmoji121"/>
+        </w:rPr>
+        <w:t>⚠</w:t>
+      </w:r>
+    </w:p>
+    <w:p>
+      <w:pPr>
+        <w:pStyle w:val="Heading2"/>
+      </w:pPr>
+      <w:bookmarkStart w:id="83" w:name="_Toc124600514"/>
+      <w:bookmarkStart w:id="84" w:name="_Toc195981297"/>
+      <w:bookmarkStart w:id="85" w:name="_Toc196031170"/>
+      <w:r>
+        <w:t>Назва другого підрозділу третього розділу</w:t>
+      </w:r>
       <w:bookmarkEnd w:id="83"/>
-    </w:p>
-    <w:p>
-      <w:r>
-        <w:rPr>
-          <w:highlight w:val="magenta"/>
-        </w:rPr>
-        <w:t>Текст першого пункту першого підрозділу третього розділу.</w:t>
-      </w:r>
-    </w:p>
-    <w:p>
-      <w:pPr>
-        <w:pStyle w:val="aff1"/>
-      </w:pPr>
-      <w:r>
-        <w:rPr>
-          <w:rStyle w:val="SegoeUIEmoji121"/>
-        </w:rPr>
-        <w:t>⚠</w:t>
-      </w:r>
-      <w:r>
-        <w:rPr>
-          <w:highlight w:val="red"/>
-        </w:rPr>
-        <w:t>Увага.</w:t>
-      </w:r>
-      <w:r>
-        <w:t xml:space="preserve"> Абзац перед назвою підрозділу оформлюється стилем «</w:t>
-      </w:r>
-      <w:r>
-        <w:t>Звичайний (останній абзац розділу/підрозділу)</w:t>
-      </w:r>
-      <w:r>
-        <w:t>».</w:t>
-      </w:r>
-      <w:r>
-        <w:rPr>
-          <w:rStyle w:val="SegoeUIEmoji121"/>
-        </w:rPr>
-        <w:t xml:space="preserve"> </w:t>
-      </w:r>
-      <w:r>
-        <w:rPr>
-          <w:rStyle w:val="SegoeUIEmoji121"/>
-        </w:rPr>
-        <w:t>⚠</w:t>
-      </w:r>
-    </w:p>
-    <w:p>
-      <w:pPr>
-        <w:pStyle w:val="Heading2"/>
-      </w:pPr>
-      <w:bookmarkStart w:id="84" w:name="_Toc124600514"/>
-      <w:bookmarkStart w:id="85" w:name="_Toc195981297"/>
-      <w:bookmarkStart w:id="86" w:name="_Toc196031170"/>
-      <w:r>
-        <w:t>Назва другого підрозділу третього розділу</w:t>
-      </w:r>
       <w:bookmarkEnd w:id="84"/>
       <w:bookmarkEnd w:id="85"/>
+    </w:p>
+    <w:p>
+      <w:r>
+        <w:rPr>
+          <w:highlight w:val="magenta"/>
+        </w:rPr>
+        <w:t>Текст першого підрозділу третього розділу.</w:t>
+      </w:r>
+    </w:p>
+    <w:p>
+      <w:pPr>
+        <w:pStyle w:val="Heading3"/>
+      </w:pPr>
+      <w:bookmarkStart w:id="86" w:name="_Toc124600515"/>
+      <w:bookmarkStart w:id="87" w:name="_Toc195981298"/>
+      <w:bookmarkStart w:id="88" w:name="_Toc196031171"/>
+      <w:r>
+        <w:t>Назва першого пункту другого підрозділу третього розділу</w:t>
+      </w:r>
       <w:bookmarkEnd w:id="86"/>
-    </w:p>
-    <w:p>
-      <w:r>
-        <w:rPr>
-          <w:highlight w:val="magenta"/>
-        </w:rPr>
-        <w:t>Текст першого підрозділу третього розділу.</w:t>
-      </w:r>
-    </w:p>
-    <w:p>
-      <w:pPr>
-        <w:pStyle w:val="Heading3"/>
-      </w:pPr>
-      <w:bookmarkStart w:id="87" w:name="_Toc124600515"/>
-      <w:bookmarkStart w:id="88" w:name="_Toc195981298"/>
-      <w:bookmarkStart w:id="89" w:name="_Toc196031171"/>
-      <w:r>
-        <w:t>Назва першого пункту другого підрозділу третього розділу</w:t>
-      </w:r>
       <w:bookmarkEnd w:id="87"/>
       <w:bookmarkEnd w:id="88"/>
+    </w:p>
+    <w:p>
+      <w:r>
+        <w:rPr>
+          <w:highlight w:val="magenta"/>
+        </w:rPr>
+        <w:t>Текст першого пункту першого підрозділу третього розділу.</w:t>
+      </w:r>
+    </w:p>
+    <w:p>
+      <w:pPr>
+        <w:pStyle w:val="Heading3"/>
+      </w:pPr>
+      <w:bookmarkStart w:id="89" w:name="_Toc124600516"/>
+      <w:bookmarkStart w:id="90" w:name="_Toc195981299"/>
+      <w:bookmarkStart w:id="91" w:name="_Toc196031172"/>
+      <w:r>
+        <w:t>Назва другого пункту другого підрозділу третього розділу</w:t>
+      </w:r>
       <w:bookmarkEnd w:id="89"/>
-    </w:p>
-    <w:p>
-      <w:r>
-        <w:rPr>
-          <w:highlight w:val="magenta"/>
-        </w:rPr>
-        <w:t>Текст першого пункту першого підрозділу третього розділу.</w:t>
-      </w:r>
-    </w:p>
-    <w:p>
-      <w:pPr>
-        <w:pStyle w:val="Heading3"/>
-      </w:pPr>
-      <w:bookmarkStart w:id="90" w:name="_Toc124600516"/>
-      <w:bookmarkStart w:id="91" w:name="_Toc195981299"/>
-      <w:bookmarkStart w:id="92" w:name="_Toc196031172"/>
-      <w:r>
-        <w:t>Назва другого пункту другого підрозділу третього розділу</w:t>
-      </w:r>
       <w:bookmarkEnd w:id="90"/>
       <w:bookmarkEnd w:id="91"/>
-      <w:bookmarkEnd w:id="92"/>
     </w:p>
     <w:p>
       <w:r>
@@ -14480,14 +14536,14 @@
       <w:pPr>
         <w:pStyle w:val="a4"/>
       </w:pPr>
-      <w:bookmarkStart w:id="93" w:name="_Toc195981302"/>
-      <w:bookmarkStart w:id="94" w:name="_Toc196031173"/>
+      <w:bookmarkStart w:id="92" w:name="_Toc195981302"/>
+      <w:bookmarkStart w:id="93" w:name="_Toc196031173"/>
       <w:r>
         <w:lastRenderedPageBreak/>
         <w:t>Висновки</w:t>
       </w:r>
+      <w:bookmarkEnd w:id="92"/>
       <w:bookmarkEnd w:id="93"/>
-      <w:bookmarkEnd w:id="94"/>
     </w:p>
     <w:p>
       <w:r>
@@ -14527,6 +14583,12 @@
       </w:r>
     </w:p>
     <w:p>
+      <w:pPr>
+        <w:rPr>
+          <w:rStyle w:val="SegoeUIEmoji121"/>
+          <w:rFonts w:asciiTheme="minorHAnsi" w:hAnsiTheme="minorHAnsi"/>
+        </w:rPr>
+      </w:pPr>
       <w:r>
         <w:t xml:space="preserve">У висновках мають бути наведені стислі </w:t>
       </w:r>
@@ -14551,27 +14613,67 @@
     </w:p>
     <w:p>
       <w:pPr>
+        <w:rPr>
+          <w:rFonts w:asciiTheme="minorHAnsi" w:hAnsiTheme="minorHAnsi"/>
+        </w:rPr>
+      </w:pPr>
+      <w:r>
+        <w:rPr>
+          <w:noProof/>
+        </w:rPr>
+        <w:fldChar w:fldCharType="begin"/>
+      </w:r>
+      <w:r>
+        <w:rPr>
+          <w:noProof/>
+        </w:rPr>
+        <w:instrText xml:space="preserve"> STYLEREF 1 \s </w:instrText>
+      </w:r>
+      <w:r>
+        <w:rPr>
+          <w:noProof/>
+        </w:rPr>
+        <w:fldChar w:fldCharType="separate"/>
+      </w:r>
+      <w:r>
+        <w:rPr>
+          <w:noProof/>
+        </w:rPr>
+        <w:t>3</w:t>
+      </w:r>
+      <w:r>
+        <w:rPr>
+          <w:noProof/>
+        </w:rPr>
+        <w:fldChar w:fldCharType="end"/>
+      </w:r>
+      <w:r>
+        <w:t>.</w:t>
+      </w:r>
+    </w:p>
+    <w:p>
+      <w:pPr>
         <w:pStyle w:val="a4"/>
       </w:pPr>
-      <w:bookmarkStart w:id="95" w:name="_Toc246321708"/>
-      <w:bookmarkStart w:id="96" w:name="_Toc246321758"/>
-      <w:bookmarkStart w:id="97" w:name="_Toc246322853"/>
-      <w:bookmarkStart w:id="98" w:name="_Toc333773914"/>
-      <w:bookmarkStart w:id="99" w:name="_Toc195981303"/>
-      <w:bookmarkStart w:id="100" w:name="_Toc196031174"/>
+      <w:bookmarkStart w:id="94" w:name="_Toc246321708"/>
+      <w:bookmarkStart w:id="95" w:name="_Toc246321758"/>
+      <w:bookmarkStart w:id="96" w:name="_Toc246322853"/>
+      <w:bookmarkStart w:id="97" w:name="_Toc333773914"/>
+      <w:bookmarkStart w:id="98" w:name="_Toc195981303"/>
+      <w:bookmarkStart w:id="99" w:name="_Toc196031174"/>
       <w:r>
         <w:lastRenderedPageBreak/>
         <w:t xml:space="preserve">Список </w:t>
       </w:r>
+      <w:bookmarkEnd w:id="94"/>
       <w:bookmarkEnd w:id="95"/>
       <w:bookmarkEnd w:id="96"/>
       <w:bookmarkEnd w:id="97"/>
+      <w:r>
+        <w:t>джерел інформації</w:t>
+      </w:r>
       <w:bookmarkEnd w:id="98"/>
-      <w:r>
-        <w:t>джерел інформації</w:t>
-      </w:r>
       <w:bookmarkEnd w:id="99"/>
-      <w:bookmarkEnd w:id="100"/>
     </w:p>
     <w:p>
       <w:pPr>
@@ -14849,8 +14951,8 @@
         <w:lastRenderedPageBreak/>
         <w:br/>
       </w:r>
-      <w:bookmarkStart w:id="101" w:name="_Toc195981304"/>
-      <w:bookmarkStart w:id="102" w:name="_Toc196031175"/>
+      <w:bookmarkStart w:id="100" w:name="_Toc195981304"/>
+      <w:bookmarkStart w:id="101" w:name="_Toc196031175"/>
       <w:r>
         <w:rPr>
           <w:highlight w:val="magenta"/>
@@ -14869,8 +14971,8 @@
         </w:rPr>
         <w:t xml:space="preserve"> А</w:t>
       </w:r>
+      <w:bookmarkEnd w:id="100"/>
       <w:bookmarkEnd w:id="101"/>
-      <w:bookmarkEnd w:id="102"/>
     </w:p>
     <w:p>
       <w:r>
@@ -15050,8 +15152,8 @@
         <w:lastRenderedPageBreak/>
         <w:br/>
       </w:r>
-      <w:bookmarkStart w:id="103" w:name="_Toc195981305"/>
-      <w:bookmarkStart w:id="104" w:name="_Toc196031176"/>
+      <w:bookmarkStart w:id="102" w:name="_Toc195981305"/>
+      <w:bookmarkStart w:id="103" w:name="_Toc196031176"/>
       <w:r>
         <w:rPr>
           <w:highlight w:val="magenta"/>
@@ -15070,8 +15172,8 @@
         </w:rPr>
         <w:t xml:space="preserve"> Б</w:t>
       </w:r>
+      <w:bookmarkEnd w:id="102"/>
       <w:bookmarkEnd w:id="103"/>
-      <w:bookmarkEnd w:id="104"/>
       <w:r>
         <w:t xml:space="preserve"> </w:t>
       </w:r>
@@ -17466,7 +17568,7 @@
 </file>
 
 <file path=word/endnotes.xml><?xml version="1.0" encoding="utf-8"?>
-<w:endnotes xmlns:wpc="http://schemas.microsoft.com/office/word/2010/wordprocessingCanvas" xmlns:cx="http://schemas.microsoft.com/office/drawing/2014/chartex" xmlns:cx1="http://schemas.microsoft.com/office/drawing/2015/9/8/chartex" xmlns:cx2="http://schemas.microsoft.com/office/drawing/2015/10/21/chartex" xmlns:cx3="http://schemas.microsoft.com/office/drawing/2016/5/9/chartex" xmlns:cx4="http://schemas.microsoft.com/office/drawing/2016/5/10/chartex" xmlns:cx5="http://schemas.microsoft.com/office/drawing/2016/5/11/chartex" xmlns:cx6="http://schemas.microsoft.com/office/drawing/2016/5/12/chartex" xmlns:cx7="http://schemas.microsoft.com/office/drawing/2016/5/13/chartex" xmlns:cx8="http://schemas.microsoft.com/office/drawing/2016/5/14/chartex" xmlns:mc="http://schemas.openxmlformats.org/markup-compatibility/2006" xmlns:aink="http://schemas.microsoft.com/office/drawing/2016/ink" xmlns:am3d="http://schemas.microsoft.com/office/drawing/2017/model3d" xmlns:o="urn:schemas-microsoft-com:office:office" xmlns:oel="http://schemas.microsoft.com/office/2019/extlst" xmlns:r="http://schemas.openxmlformats.org/officeDocument/2006/relationships" xmlns:m="http://schemas.openxmlformats.org/officeDocument/2006/math" xmlns:v="urn:schemas-microsoft-com:vml" xmlns:wp14="http://schemas.microsoft.com/office/word/2010/wordprocessingDrawing" xmlns:wp="http://schemas.openxmlformats.org/drawingml/2006/wordprocessingDrawing" xmlns:w10="urn:schemas-microsoft-com:office:word" xmlns:w="http://schemas.openxmlformats.org/wordprocessingml/2006/main" xmlns:w14="http://schemas.microsoft.com/office/word/2010/wordml" xmlns:w15="http://schemas.microsoft.com/office/word/2012/wordml" xmlns:w16cex="http://schemas.microsoft.com/office/word/2018/wordml/cex" xmlns:w16cid="http://schemas.microsoft.com/office/word/2016/wordml/cid" xmlns:w16="http://schemas.microsoft.com/office/word/2018/wordml" xmlns:w16du="http://schemas.microsoft.com/office/word/2023/wordml/word16du" xmlns:w16sdtdh="http://schemas.microsoft.com/office/word/2020/wordml/sdtdatahash" xmlns:w16sdtfl="http://schemas.microsoft.com/office/word/2024/wordml/sdtformatlock" xmlns:w16se="http://schemas.microsoft.com/office/word/2015/wordml/symex" xmlns:wpg="http://schemas.microsoft.com/office/word/2010/wordprocessingGroup" xmlns:wpi="http://schemas.microsoft.com/office/word/2010/wordprocessingInk" xmlns:wne="http://schemas.microsoft.com/office/word/2006/wordml" xmlns:wps="http://schemas.microsoft.com/office/word/2010/wordprocessingShape" mc:Ignorable="w14 w15 w16se w16cid w16 w16cex w16sdtdh w16sdtfl w16du wp14">
+<w:endnotes xmlns:wpc="http://schemas.microsoft.com/office/word/2010/wordprocessingCanvas" xmlns:cx="http://schemas.microsoft.com/office/drawing/2014/chartex" xmlns:cx1="http://schemas.microsoft.com/office/drawing/2015/9/8/chartex" xmlns:cx2="http://schemas.microsoft.com/office/drawing/2015/10/21/chartex" xmlns:cx3="http://schemas.microsoft.com/office/drawing/2016/5/9/chartex" xmlns:cx4="http://schemas.microsoft.com/office/drawing/2016/5/10/chartex" xmlns:cx5="http://schemas.microsoft.com/office/drawing/2016/5/11/chartex" xmlns:cx6="http://schemas.microsoft.com/office/drawing/2016/5/12/chartex" xmlns:cx7="http://schemas.microsoft.com/office/drawing/2016/5/13/chartex" xmlns:cx8="http://schemas.microsoft.com/office/drawing/2016/5/14/chartex" xmlns:mc="http://schemas.openxmlformats.org/markup-compatibility/2006" xmlns:aink="http://schemas.microsoft.com/office/drawing/2016/ink" xmlns:am3d="http://schemas.microsoft.com/office/drawing/2017/model3d" xmlns:o="urn:schemas-microsoft-com:office:office" xmlns:oel="http://schemas.microsoft.com/office/2019/extlst" xmlns:r="http://schemas.openxmlformats.org/officeDocument/2006/relationships" xmlns:m="http://schemas.openxmlformats.org/officeDocument/2006/math" xmlns:v="urn:schemas-microsoft-com:vml" xmlns:wp14="http://schemas.microsoft.com/office/word/2010/wordprocessingDrawing" xmlns:wp="http://schemas.openxmlformats.org/drawingml/2006/wordprocessingDrawing" xmlns:w10="urn:schemas-microsoft-com:office:word" xmlns:w="http://schemas.openxmlformats.org/wordprocessingml/2006/main" xmlns:w14="http://schemas.microsoft.com/office/word/2010/wordml" xmlns:w15="http://schemas.microsoft.com/office/word/2012/wordml" xmlns:w16cex="http://schemas.microsoft.com/office/word/2018/wordml/cex" xmlns:w16cid="http://schemas.microsoft.com/office/word/2016/wordml/cid" xmlns:w16="http://schemas.microsoft.com/office/word/2018/wordml" xmlns:w16sdtdh="http://schemas.microsoft.com/office/word/2020/wordml/sdtdatahash" xmlns:w16se="http://schemas.microsoft.com/office/word/2015/wordml/symex" xmlns:wpg="http://schemas.microsoft.com/office/word/2010/wordprocessingGroup" xmlns:wpi="http://schemas.microsoft.com/office/word/2010/wordprocessingInk" xmlns:wne="http://schemas.microsoft.com/office/word/2006/wordml" xmlns:wps="http://schemas.microsoft.com/office/word/2010/wordprocessingShape" mc:Ignorable="w14 w15 w16se w16cid w16 w16cex w16sdtdh wp14">
   <w:endnote w:type="separator" w:id="-1">
     <w:p>
       <w:r>
@@ -17521,7 +17623,7 @@
 </file>
 
 <file path=word/footer1.xml><?xml version="1.0" encoding="utf-8"?>
-<w:ftr xmlns:wpc="http://schemas.microsoft.com/office/word/2010/wordprocessingCanvas" xmlns:cx="http://schemas.microsoft.com/office/drawing/2014/chartex" xmlns:cx1="http://schemas.microsoft.com/office/drawing/2015/9/8/chartex" xmlns:cx2="http://schemas.microsoft.com/office/drawing/2015/10/21/chartex" xmlns:cx3="http://schemas.microsoft.com/office/drawing/2016/5/9/chartex" xmlns:cx4="http://schemas.microsoft.com/office/drawing/2016/5/10/chartex" xmlns:cx5="http://schemas.microsoft.com/office/drawing/2016/5/11/chartex" xmlns:cx6="http://schemas.microsoft.com/office/drawing/2016/5/12/chartex" xmlns:cx7="http://schemas.microsoft.com/office/drawing/2016/5/13/chartex" xmlns:cx8="http://schemas.microsoft.com/office/drawing/2016/5/14/chartex" xmlns:mc="http://schemas.openxmlformats.org/markup-compatibility/2006" xmlns:aink="http://schemas.microsoft.com/office/drawing/2016/ink" xmlns:am3d="http://schemas.microsoft.com/office/drawing/2017/model3d" xmlns:o="urn:schemas-microsoft-com:office:office" xmlns:oel="http://schemas.microsoft.com/office/2019/extlst" xmlns:r="http://schemas.openxmlformats.org/officeDocument/2006/relationships" xmlns:m="http://schemas.openxmlformats.org/officeDocument/2006/math" xmlns:v="urn:schemas-microsoft-com:vml" xmlns:wp14="http://schemas.microsoft.com/office/word/2010/wordprocessingDrawing" xmlns:wp="http://schemas.openxmlformats.org/drawingml/2006/wordprocessingDrawing" xmlns:w10="urn:schemas-microsoft-com:office:word" xmlns:w="http://schemas.openxmlformats.org/wordprocessingml/2006/main" xmlns:w14="http://schemas.microsoft.com/office/word/2010/wordml" xmlns:w15="http://schemas.microsoft.com/office/word/2012/wordml" xmlns:w16cex="http://schemas.microsoft.com/office/word/2018/wordml/cex" xmlns:w16cid="http://schemas.microsoft.com/office/word/2016/wordml/cid" xmlns:w16="http://schemas.microsoft.com/office/word/2018/wordml" xmlns:w16du="http://schemas.microsoft.com/office/word/2023/wordml/word16du" xmlns:w16sdtdh="http://schemas.microsoft.com/office/word/2020/wordml/sdtdatahash" xmlns:w16sdtfl="http://schemas.microsoft.com/office/word/2024/wordml/sdtformatlock" xmlns:w16se="http://schemas.microsoft.com/office/word/2015/wordml/symex" xmlns:wpg="http://schemas.microsoft.com/office/word/2010/wordprocessingGroup" xmlns:wpi="http://schemas.microsoft.com/office/word/2010/wordprocessingInk" xmlns:wne="http://schemas.microsoft.com/office/word/2006/wordml" xmlns:wps="http://schemas.microsoft.com/office/word/2010/wordprocessingShape" mc:Ignorable="w14 w15 w16se w16cid w16 w16cex w16sdtdh w16sdtfl w16du wp14">
+<w:ftr xmlns:wpc="http://schemas.microsoft.com/office/word/2010/wordprocessingCanvas" xmlns:cx="http://schemas.microsoft.com/office/drawing/2014/chartex" xmlns:cx1="http://schemas.microsoft.com/office/drawing/2015/9/8/chartex" xmlns:cx2="http://schemas.microsoft.com/office/drawing/2015/10/21/chartex" xmlns:cx3="http://schemas.microsoft.com/office/drawing/2016/5/9/chartex" xmlns:cx4="http://schemas.microsoft.com/office/drawing/2016/5/10/chartex" xmlns:cx5="http://schemas.microsoft.com/office/drawing/2016/5/11/chartex" xmlns:cx6="http://schemas.microsoft.com/office/drawing/2016/5/12/chartex" xmlns:cx7="http://schemas.microsoft.com/office/drawing/2016/5/13/chartex" xmlns:cx8="http://schemas.microsoft.com/office/drawing/2016/5/14/chartex" xmlns:mc="http://schemas.openxmlformats.org/markup-compatibility/2006" xmlns:aink="http://schemas.microsoft.com/office/drawing/2016/ink" xmlns:am3d="http://schemas.microsoft.com/office/drawing/2017/model3d" xmlns:o="urn:schemas-microsoft-com:office:office" xmlns:oel="http://schemas.microsoft.com/office/2019/extlst" xmlns:r="http://schemas.openxmlformats.org/officeDocument/2006/relationships" xmlns:m="http://schemas.openxmlformats.org/officeDocument/2006/math" xmlns:v="urn:schemas-microsoft-com:vml" xmlns:wp14="http://schemas.microsoft.com/office/word/2010/wordprocessingDrawing" xmlns:wp="http://schemas.openxmlformats.org/drawingml/2006/wordprocessingDrawing" xmlns:w10="urn:schemas-microsoft-com:office:word" xmlns:w="http://schemas.openxmlformats.org/wordprocessingml/2006/main" xmlns:w14="http://schemas.microsoft.com/office/word/2010/wordml" xmlns:w15="http://schemas.microsoft.com/office/word/2012/wordml" xmlns:w16cex="http://schemas.microsoft.com/office/word/2018/wordml/cex" xmlns:w16cid="http://schemas.microsoft.com/office/word/2016/wordml/cid" xmlns:w16="http://schemas.microsoft.com/office/word/2018/wordml" xmlns:w16sdtdh="http://schemas.microsoft.com/office/word/2020/wordml/sdtdatahash" xmlns:w16se="http://schemas.microsoft.com/office/word/2015/wordml/symex" xmlns:wpg="http://schemas.microsoft.com/office/word/2010/wordprocessingGroup" xmlns:wpi="http://schemas.microsoft.com/office/word/2010/wordprocessingInk" xmlns:wne="http://schemas.microsoft.com/office/word/2006/wordml" xmlns:wps="http://schemas.microsoft.com/office/word/2010/wordprocessingShape" mc:Ignorable="w14 w15 w16se w16cid w16 w16cex w16sdtdh wp14">
   <w:p>
     <w:pPr>
       <w:pStyle w:val="Footer"/>
@@ -17570,7 +17672,7 @@
 </file>
 
 <file path=word/footer2.xml><?xml version="1.0" encoding="utf-8"?>
-<w:ftr xmlns:wpc="http://schemas.microsoft.com/office/word/2010/wordprocessingCanvas" xmlns:cx="http://schemas.microsoft.com/office/drawing/2014/chartex" xmlns:cx1="http://schemas.microsoft.com/office/drawing/2015/9/8/chartex" xmlns:cx2="http://schemas.microsoft.com/office/drawing/2015/10/21/chartex" xmlns:cx3="http://schemas.microsoft.com/office/drawing/2016/5/9/chartex" xmlns:cx4="http://schemas.microsoft.com/office/drawing/2016/5/10/chartex" xmlns:cx5="http://schemas.microsoft.com/office/drawing/2016/5/11/chartex" xmlns:cx6="http://schemas.microsoft.com/office/drawing/2016/5/12/chartex" xmlns:cx7="http://schemas.microsoft.com/office/drawing/2016/5/13/chartex" xmlns:cx8="http://schemas.microsoft.com/office/drawing/2016/5/14/chartex" xmlns:mc="http://schemas.openxmlformats.org/markup-compatibility/2006" xmlns:aink="http://schemas.microsoft.com/office/drawing/2016/ink" xmlns:am3d="http://schemas.microsoft.com/office/drawing/2017/model3d" xmlns:o="urn:schemas-microsoft-com:office:office" xmlns:oel="http://schemas.microsoft.com/office/2019/extlst" xmlns:r="http://schemas.openxmlformats.org/officeDocument/2006/relationships" xmlns:m="http://schemas.openxmlformats.org/officeDocument/2006/math" xmlns:v="urn:schemas-microsoft-com:vml" xmlns:wp14="http://schemas.microsoft.com/office/word/2010/wordprocessingDrawing" xmlns:wp="http://schemas.openxmlformats.org/drawingml/2006/wordprocessingDrawing" xmlns:w10="urn:schemas-microsoft-com:office:word" xmlns:w="http://schemas.openxmlformats.org/wordprocessingml/2006/main" xmlns:w14="http://schemas.microsoft.com/office/word/2010/wordml" xmlns:w15="http://schemas.microsoft.com/office/word/2012/wordml" xmlns:w16cex="http://schemas.microsoft.com/office/word/2018/wordml/cex" xmlns:w16cid="http://schemas.microsoft.com/office/word/2016/wordml/cid" xmlns:w16="http://schemas.microsoft.com/office/word/2018/wordml" xmlns:w16du="http://schemas.microsoft.com/office/word/2023/wordml/word16du" xmlns:w16sdtdh="http://schemas.microsoft.com/office/word/2020/wordml/sdtdatahash" xmlns:w16sdtfl="http://schemas.microsoft.com/office/word/2024/wordml/sdtformatlock" xmlns:w16se="http://schemas.microsoft.com/office/word/2015/wordml/symex" xmlns:wpg="http://schemas.microsoft.com/office/word/2010/wordprocessingGroup" xmlns:wpi="http://schemas.microsoft.com/office/word/2010/wordprocessingInk" xmlns:wne="http://schemas.microsoft.com/office/word/2006/wordml" xmlns:wps="http://schemas.microsoft.com/office/word/2010/wordprocessingShape" mc:Ignorable="w14 w15 w16se w16cid w16 w16cex w16sdtdh w16sdtfl w16du wp14">
+<w:ftr xmlns:wpc="http://schemas.microsoft.com/office/word/2010/wordprocessingCanvas" xmlns:cx="http://schemas.microsoft.com/office/drawing/2014/chartex" xmlns:cx1="http://schemas.microsoft.com/office/drawing/2015/9/8/chartex" xmlns:cx2="http://schemas.microsoft.com/office/drawing/2015/10/21/chartex" xmlns:cx3="http://schemas.microsoft.com/office/drawing/2016/5/9/chartex" xmlns:cx4="http://schemas.microsoft.com/office/drawing/2016/5/10/chartex" xmlns:cx5="http://schemas.microsoft.com/office/drawing/2016/5/11/chartex" xmlns:cx6="http://schemas.microsoft.com/office/drawing/2016/5/12/chartex" xmlns:cx7="http://schemas.microsoft.com/office/drawing/2016/5/13/chartex" xmlns:cx8="http://schemas.microsoft.com/office/drawing/2016/5/14/chartex" xmlns:mc="http://schemas.openxmlformats.org/markup-compatibility/2006" xmlns:aink="http://schemas.microsoft.com/office/drawing/2016/ink" xmlns:am3d="http://schemas.microsoft.com/office/drawing/2017/model3d" xmlns:o="urn:schemas-microsoft-com:office:office" xmlns:oel="http://schemas.microsoft.com/office/2019/extlst" xmlns:r="http://schemas.openxmlformats.org/officeDocument/2006/relationships" xmlns:m="http://schemas.openxmlformats.org/officeDocument/2006/math" xmlns:v="urn:schemas-microsoft-com:vml" xmlns:wp14="http://schemas.microsoft.com/office/word/2010/wordprocessingDrawing" xmlns:wp="http://schemas.openxmlformats.org/drawingml/2006/wordprocessingDrawing" xmlns:w10="urn:schemas-microsoft-com:office:word" xmlns:w="http://schemas.openxmlformats.org/wordprocessingml/2006/main" xmlns:w14="http://schemas.microsoft.com/office/word/2010/wordml" xmlns:w15="http://schemas.microsoft.com/office/word/2012/wordml" xmlns:w16cex="http://schemas.microsoft.com/office/word/2018/wordml/cex" xmlns:w16cid="http://schemas.microsoft.com/office/word/2016/wordml/cid" xmlns:w16="http://schemas.microsoft.com/office/word/2018/wordml" xmlns:w16sdtdh="http://schemas.microsoft.com/office/word/2020/wordml/sdtdatahash" xmlns:w16se="http://schemas.microsoft.com/office/word/2015/wordml/symex" xmlns:wpg="http://schemas.microsoft.com/office/word/2010/wordprocessingGroup" xmlns:wpi="http://schemas.microsoft.com/office/word/2010/wordprocessingInk" xmlns:wne="http://schemas.microsoft.com/office/word/2006/wordml" xmlns:wps="http://schemas.microsoft.com/office/word/2010/wordprocessingShape" mc:Ignorable="w14 w15 w16se w16cid w16 w16cex w16sdtdh wp14">
   <w:p>
     <w:pPr>
       <w:pStyle w:val="Footer"/>
@@ -17611,7 +17713,7 @@
 </file>
 
 <file path=word/footnotes.xml><?xml version="1.0" encoding="utf-8"?>
-<w:footnotes xmlns:wpc="http://schemas.microsoft.com/office/word/2010/wordprocessingCanvas" xmlns:cx="http://schemas.microsoft.com/office/drawing/2014/chartex" xmlns:cx1="http://schemas.microsoft.com/office/drawing/2015/9/8/chartex" xmlns:cx2="http://schemas.microsoft.com/office/drawing/2015/10/21/chartex" xmlns:cx3="http://schemas.microsoft.com/office/drawing/2016/5/9/chartex" xmlns:cx4="http://schemas.microsoft.com/office/drawing/2016/5/10/chartex" xmlns:cx5="http://schemas.microsoft.com/office/drawing/2016/5/11/chartex" xmlns:cx6="http://schemas.microsoft.com/office/drawing/2016/5/12/chartex" xmlns:cx7="http://schemas.microsoft.com/office/drawing/2016/5/13/chartex" xmlns:cx8="http://schemas.microsoft.com/office/drawing/2016/5/14/chartex" xmlns:mc="http://schemas.openxmlformats.org/markup-compatibility/2006" xmlns:aink="http://schemas.microsoft.com/office/drawing/2016/ink" xmlns:am3d="http://schemas.microsoft.com/office/drawing/2017/model3d" xmlns:o="urn:schemas-microsoft-com:office:office" xmlns:oel="http://schemas.microsoft.com/office/2019/extlst" xmlns:r="http://schemas.openxmlformats.org/officeDocument/2006/relationships" xmlns:m="http://schemas.openxmlformats.org/officeDocument/2006/math" xmlns:v="urn:schemas-microsoft-com:vml" xmlns:wp14="http://schemas.microsoft.com/office/word/2010/wordprocessingDrawing" xmlns:wp="http://schemas.openxmlformats.org/drawingml/2006/wordprocessingDrawing" xmlns:w10="urn:schemas-microsoft-com:office:word" xmlns:w="http://schemas.openxmlformats.org/wordprocessingml/2006/main" xmlns:w14="http://schemas.microsoft.com/office/word/2010/wordml" xmlns:w15="http://schemas.microsoft.com/office/word/2012/wordml" xmlns:w16cex="http://schemas.microsoft.com/office/word/2018/wordml/cex" xmlns:w16cid="http://schemas.microsoft.com/office/word/2016/wordml/cid" xmlns:w16="http://schemas.microsoft.com/office/word/2018/wordml" xmlns:w16du="http://schemas.microsoft.com/office/word/2023/wordml/word16du" xmlns:w16sdtdh="http://schemas.microsoft.com/office/word/2020/wordml/sdtdatahash" xmlns:w16sdtfl="http://schemas.microsoft.com/office/word/2024/wordml/sdtformatlock" xmlns:w16se="http://schemas.microsoft.com/office/word/2015/wordml/symex" xmlns:wpg="http://schemas.microsoft.com/office/word/2010/wordprocessingGroup" xmlns:wpi="http://schemas.microsoft.com/office/word/2010/wordprocessingInk" xmlns:wne="http://schemas.microsoft.com/office/word/2006/wordml" xmlns:wps="http://schemas.microsoft.com/office/word/2010/wordprocessingShape" mc:Ignorable="w14 w15 w16se w16cid w16 w16cex w16sdtdh w16sdtfl w16du wp14">
+<w:footnotes xmlns:wpc="http://schemas.microsoft.com/office/word/2010/wordprocessingCanvas" xmlns:cx="http://schemas.microsoft.com/office/drawing/2014/chartex" xmlns:cx1="http://schemas.microsoft.com/office/drawing/2015/9/8/chartex" xmlns:cx2="http://schemas.microsoft.com/office/drawing/2015/10/21/chartex" xmlns:cx3="http://schemas.microsoft.com/office/drawing/2016/5/9/chartex" xmlns:cx4="http://schemas.microsoft.com/office/drawing/2016/5/10/chartex" xmlns:cx5="http://schemas.microsoft.com/office/drawing/2016/5/11/chartex" xmlns:cx6="http://schemas.microsoft.com/office/drawing/2016/5/12/chartex" xmlns:cx7="http://schemas.microsoft.com/office/drawing/2016/5/13/chartex" xmlns:cx8="http://schemas.microsoft.com/office/drawing/2016/5/14/chartex" xmlns:mc="http://schemas.openxmlformats.org/markup-compatibility/2006" xmlns:aink="http://schemas.microsoft.com/office/drawing/2016/ink" xmlns:am3d="http://schemas.microsoft.com/office/drawing/2017/model3d" xmlns:o="urn:schemas-microsoft-com:office:office" xmlns:oel="http://schemas.microsoft.com/office/2019/extlst" xmlns:r="http://schemas.openxmlformats.org/officeDocument/2006/relationships" xmlns:m="http://schemas.openxmlformats.org/officeDocument/2006/math" xmlns:v="urn:schemas-microsoft-com:vml" xmlns:wp14="http://schemas.microsoft.com/office/word/2010/wordprocessingDrawing" xmlns:wp="http://schemas.openxmlformats.org/drawingml/2006/wordprocessingDrawing" xmlns:w10="urn:schemas-microsoft-com:office:word" xmlns:w="http://schemas.openxmlformats.org/wordprocessingml/2006/main" xmlns:w14="http://schemas.microsoft.com/office/word/2010/wordml" xmlns:w15="http://schemas.microsoft.com/office/word/2012/wordml" xmlns:w16cex="http://schemas.microsoft.com/office/word/2018/wordml/cex" xmlns:w16cid="http://schemas.microsoft.com/office/word/2016/wordml/cid" xmlns:w16="http://schemas.microsoft.com/office/word/2018/wordml" xmlns:w16sdtdh="http://schemas.microsoft.com/office/word/2020/wordml/sdtdatahash" xmlns:w16se="http://schemas.microsoft.com/office/word/2015/wordml/symex" xmlns:wpg="http://schemas.microsoft.com/office/word/2010/wordprocessingGroup" xmlns:wpi="http://schemas.microsoft.com/office/word/2010/wordprocessingInk" xmlns:wne="http://schemas.microsoft.com/office/word/2006/wordml" xmlns:wps="http://schemas.microsoft.com/office/word/2010/wordprocessingShape" mc:Ignorable="w14 w15 w16se w16cid w16 w16cex w16sdtdh wp14">
   <w:footnote w:type="separator" w:id="-1">
     <w:p>
       <w:pPr>
@@ -17659,7 +17761,7 @@
 </file>
 
 <file path=word/header1.xml><?xml version="1.0" encoding="utf-8"?>
-<w:hdr xmlns:wpc="http://schemas.microsoft.com/office/word/2010/wordprocessingCanvas" xmlns:cx="http://schemas.microsoft.com/office/drawing/2014/chartex" xmlns:cx1="http://schemas.microsoft.com/office/drawing/2015/9/8/chartex" xmlns:cx2="http://schemas.microsoft.com/office/drawing/2015/10/21/chartex" xmlns:cx3="http://schemas.microsoft.com/office/drawing/2016/5/9/chartex" xmlns:cx4="http://schemas.microsoft.com/office/drawing/2016/5/10/chartex" xmlns:cx5="http://schemas.microsoft.com/office/drawing/2016/5/11/chartex" xmlns:cx6="http://schemas.microsoft.com/office/drawing/2016/5/12/chartex" xmlns:cx7="http://schemas.microsoft.com/office/drawing/2016/5/13/chartex" xmlns:cx8="http://schemas.microsoft.com/office/drawing/2016/5/14/chartex" xmlns:mc="http://schemas.openxmlformats.org/markup-compatibility/2006" xmlns:aink="http://schemas.microsoft.com/office/drawing/2016/ink" xmlns:am3d="http://schemas.microsoft.com/office/drawing/2017/model3d" xmlns:o="urn:schemas-microsoft-com:office:office" xmlns:oel="http://schemas.microsoft.com/office/2019/extlst" xmlns:r="http://schemas.openxmlformats.org/officeDocument/2006/relationships" xmlns:m="http://schemas.openxmlformats.org/officeDocument/2006/math" xmlns:v="urn:schemas-microsoft-com:vml" xmlns:wp14="http://schemas.microsoft.com/office/word/2010/wordprocessingDrawing" xmlns:wp="http://schemas.openxmlformats.org/drawingml/2006/wordprocessingDrawing" xmlns:w10="urn:schemas-microsoft-com:office:word" xmlns:w="http://schemas.openxmlformats.org/wordprocessingml/2006/main" xmlns:w14="http://schemas.microsoft.com/office/word/2010/wordml" xmlns:w15="http://schemas.microsoft.com/office/word/2012/wordml" xmlns:w16cex="http://schemas.microsoft.com/office/word/2018/wordml/cex" xmlns:w16cid="http://schemas.microsoft.com/office/word/2016/wordml/cid" xmlns:w16="http://schemas.microsoft.com/office/word/2018/wordml" xmlns:w16du="http://schemas.microsoft.com/office/word/2023/wordml/word16du" xmlns:w16sdtdh="http://schemas.microsoft.com/office/word/2020/wordml/sdtdatahash" xmlns:w16sdtfl="http://schemas.microsoft.com/office/word/2024/wordml/sdtformatlock" xmlns:w16se="http://schemas.microsoft.com/office/word/2015/wordml/symex" xmlns:wpg="http://schemas.microsoft.com/office/word/2010/wordprocessingGroup" xmlns:wpi="http://schemas.microsoft.com/office/word/2010/wordprocessingInk" xmlns:wne="http://schemas.microsoft.com/office/word/2006/wordml" xmlns:wps="http://schemas.microsoft.com/office/word/2010/wordprocessingShape" mc:Ignorable="w14 w15 w16se w16cid w16 w16cex w16sdtdh w16sdtfl w16du wp14">
+<w:hdr xmlns:wpc="http://schemas.microsoft.com/office/word/2010/wordprocessingCanvas" xmlns:cx="http://schemas.microsoft.com/office/drawing/2014/chartex" xmlns:cx1="http://schemas.microsoft.com/office/drawing/2015/9/8/chartex" xmlns:cx2="http://schemas.microsoft.com/office/drawing/2015/10/21/chartex" xmlns:cx3="http://schemas.microsoft.com/office/drawing/2016/5/9/chartex" xmlns:cx4="http://schemas.microsoft.com/office/drawing/2016/5/10/chartex" xmlns:cx5="http://schemas.microsoft.com/office/drawing/2016/5/11/chartex" xmlns:cx6="http://schemas.microsoft.com/office/drawing/2016/5/12/chartex" xmlns:cx7="http://schemas.microsoft.com/office/drawing/2016/5/13/chartex" xmlns:cx8="http://schemas.microsoft.com/office/drawing/2016/5/14/chartex" xmlns:mc="http://schemas.openxmlformats.org/markup-compatibility/2006" xmlns:aink="http://schemas.microsoft.com/office/drawing/2016/ink" xmlns:am3d="http://schemas.microsoft.com/office/drawing/2017/model3d" xmlns:o="urn:schemas-microsoft-com:office:office" xmlns:oel="http://schemas.microsoft.com/office/2019/extlst" xmlns:r="http://schemas.openxmlformats.org/officeDocument/2006/relationships" xmlns:m="http://schemas.openxmlformats.org/officeDocument/2006/math" xmlns:v="urn:schemas-microsoft-com:vml" xmlns:wp14="http://schemas.microsoft.com/office/word/2010/wordprocessingDrawing" xmlns:wp="http://schemas.openxmlformats.org/drawingml/2006/wordprocessingDrawing" xmlns:w10="urn:schemas-microsoft-com:office:word" xmlns:w="http://schemas.openxmlformats.org/wordprocessingml/2006/main" xmlns:w14="http://schemas.microsoft.com/office/word/2010/wordml" xmlns:w15="http://schemas.microsoft.com/office/word/2012/wordml" xmlns:w16cex="http://schemas.microsoft.com/office/word/2018/wordml/cex" xmlns:w16cid="http://schemas.microsoft.com/office/word/2016/wordml/cid" xmlns:w16="http://schemas.microsoft.com/office/word/2018/wordml" xmlns:w16sdtdh="http://schemas.microsoft.com/office/word/2020/wordml/sdtdatahash" xmlns:w16se="http://schemas.microsoft.com/office/word/2015/wordml/symex" xmlns:wpg="http://schemas.microsoft.com/office/word/2010/wordprocessingGroup" xmlns:wpi="http://schemas.microsoft.com/office/word/2010/wordprocessingInk" xmlns:wne="http://schemas.microsoft.com/office/word/2006/wordml" xmlns:wps="http://schemas.microsoft.com/office/word/2010/wordprocessingShape" mc:Ignorable="w14 w15 w16se w16cid w16 w16cex w16sdtdh wp14">
   <w:p>
     <w:pPr>
       <w:pStyle w:val="Header"/>
@@ -17716,7 +17818,7 @@
 </file>
 
 <file path=word/header2.xml><?xml version="1.0" encoding="utf-8"?>
-<w:hdr xmlns:wpc="http://schemas.microsoft.com/office/word/2010/wordprocessingCanvas" xmlns:cx="http://schemas.microsoft.com/office/drawing/2014/chartex" xmlns:cx1="http://schemas.microsoft.com/office/drawing/2015/9/8/chartex" xmlns:cx2="http://schemas.microsoft.com/office/drawing/2015/10/21/chartex" xmlns:cx3="http://schemas.microsoft.com/office/drawing/2016/5/9/chartex" xmlns:cx4="http://schemas.microsoft.com/office/drawing/2016/5/10/chartex" xmlns:cx5="http://schemas.microsoft.com/office/drawing/2016/5/11/chartex" xmlns:cx6="http://schemas.microsoft.com/office/drawing/2016/5/12/chartex" xmlns:cx7="http://schemas.microsoft.com/office/drawing/2016/5/13/chartex" xmlns:cx8="http://schemas.microsoft.com/office/drawing/2016/5/14/chartex" xmlns:mc="http://schemas.openxmlformats.org/markup-compatibility/2006" xmlns:aink="http://schemas.microsoft.com/office/drawing/2016/ink" xmlns:am3d="http://schemas.microsoft.com/office/drawing/2017/model3d" xmlns:o="urn:schemas-microsoft-com:office:office" xmlns:oel="http://schemas.microsoft.com/office/2019/extlst" xmlns:r="http://schemas.openxmlformats.org/officeDocument/2006/relationships" xmlns:m="http://schemas.openxmlformats.org/officeDocument/2006/math" xmlns:v="urn:schemas-microsoft-com:vml" xmlns:wp14="http://schemas.microsoft.com/office/word/2010/wordprocessingDrawing" xmlns:wp="http://schemas.openxmlformats.org/drawingml/2006/wordprocessingDrawing" xmlns:w10="urn:schemas-microsoft-com:office:word" xmlns:w="http://schemas.openxmlformats.org/wordprocessingml/2006/main" xmlns:w14="http://schemas.microsoft.com/office/word/2010/wordml" xmlns:w15="http://schemas.microsoft.com/office/word/2012/wordml" xmlns:w16cex="http://schemas.microsoft.com/office/word/2018/wordml/cex" xmlns:w16cid="http://schemas.microsoft.com/office/word/2016/wordml/cid" xmlns:w16="http://schemas.microsoft.com/office/word/2018/wordml" xmlns:w16du="http://schemas.microsoft.com/office/word/2023/wordml/word16du" xmlns:w16sdtdh="http://schemas.microsoft.com/office/word/2020/wordml/sdtdatahash" xmlns:w16sdtfl="http://schemas.microsoft.com/office/word/2024/wordml/sdtformatlock" xmlns:w16se="http://schemas.microsoft.com/office/word/2015/wordml/symex" xmlns:wpg="http://schemas.microsoft.com/office/word/2010/wordprocessingGroup" xmlns:wpi="http://schemas.microsoft.com/office/word/2010/wordprocessingInk" xmlns:wne="http://schemas.microsoft.com/office/word/2006/wordml" xmlns:wps="http://schemas.microsoft.com/office/word/2010/wordprocessingShape" mc:Ignorable="w14 w15 w16se w16cid w16 w16cex w16sdtdh w16sdtfl w16du wp14">
+<w:hdr xmlns:wpc="http://schemas.microsoft.com/office/word/2010/wordprocessingCanvas" xmlns:cx="http://schemas.microsoft.com/office/drawing/2014/chartex" xmlns:cx1="http://schemas.microsoft.com/office/drawing/2015/9/8/chartex" xmlns:cx2="http://schemas.microsoft.com/office/drawing/2015/10/21/chartex" xmlns:cx3="http://schemas.microsoft.com/office/drawing/2016/5/9/chartex" xmlns:cx4="http://schemas.microsoft.com/office/drawing/2016/5/10/chartex" xmlns:cx5="http://schemas.microsoft.com/office/drawing/2016/5/11/chartex" xmlns:cx6="http://schemas.microsoft.com/office/drawing/2016/5/12/chartex" xmlns:cx7="http://schemas.microsoft.com/office/drawing/2016/5/13/chartex" xmlns:cx8="http://schemas.microsoft.com/office/drawing/2016/5/14/chartex" xmlns:mc="http://schemas.openxmlformats.org/markup-compatibility/2006" xmlns:aink="http://schemas.microsoft.com/office/drawing/2016/ink" xmlns:am3d="http://schemas.microsoft.com/office/drawing/2017/model3d" xmlns:o="urn:schemas-microsoft-com:office:office" xmlns:oel="http://schemas.microsoft.com/office/2019/extlst" xmlns:r="http://schemas.openxmlformats.org/officeDocument/2006/relationships" xmlns:m="http://schemas.openxmlformats.org/officeDocument/2006/math" xmlns:v="urn:schemas-microsoft-com:vml" xmlns:wp14="http://schemas.microsoft.com/office/word/2010/wordprocessingDrawing" xmlns:wp="http://schemas.openxmlformats.org/drawingml/2006/wordprocessingDrawing" xmlns:w10="urn:schemas-microsoft-com:office:word" xmlns:w="http://schemas.openxmlformats.org/wordprocessingml/2006/main" xmlns:w14="http://schemas.microsoft.com/office/word/2010/wordml" xmlns:w15="http://schemas.microsoft.com/office/word/2012/wordml" xmlns:w16cex="http://schemas.microsoft.com/office/word/2018/wordml/cex" xmlns:w16cid="http://schemas.microsoft.com/office/word/2016/wordml/cid" xmlns:w16="http://schemas.microsoft.com/office/word/2018/wordml" xmlns:w16sdtdh="http://schemas.microsoft.com/office/word/2020/wordml/sdtdatahash" xmlns:w16se="http://schemas.microsoft.com/office/word/2015/wordml/symex" xmlns:wpg="http://schemas.microsoft.com/office/word/2010/wordprocessingGroup" xmlns:wpi="http://schemas.microsoft.com/office/word/2010/wordprocessingInk" xmlns:wne="http://schemas.microsoft.com/office/word/2006/wordml" xmlns:wps="http://schemas.microsoft.com/office/word/2010/wordprocessingShape" mc:Ignorable="w14 w15 w16se w16cid w16 w16cex w16sdtdh wp14">
   <w:p>
     <w:pPr>
       <w:pStyle w:val="Header"/>
@@ -17765,7 +17867,7 @@
 </file>
 
 <file path=word/header3.xml><?xml version="1.0" encoding="utf-8"?>
-<w:hdr xmlns:wpc="http://schemas.microsoft.com/office/word/2010/wordprocessingCanvas" xmlns:cx="http://schemas.microsoft.com/office/drawing/2014/chartex" xmlns:cx1="http://schemas.microsoft.com/office/drawing/2015/9/8/chartex" xmlns:cx2="http://schemas.microsoft.com/office/drawing/2015/10/21/chartex" xmlns:cx3="http://schemas.microsoft.com/office/drawing/2016/5/9/chartex" xmlns:cx4="http://schemas.microsoft.com/office/drawing/2016/5/10/chartex" xmlns:cx5="http://schemas.microsoft.com/office/drawing/2016/5/11/chartex" xmlns:cx6="http://schemas.microsoft.com/office/drawing/2016/5/12/chartex" xmlns:cx7="http://schemas.microsoft.com/office/drawing/2016/5/13/chartex" xmlns:cx8="http://schemas.microsoft.com/office/drawing/2016/5/14/chartex" xmlns:mc="http://schemas.openxmlformats.org/markup-compatibility/2006" xmlns:aink="http://schemas.microsoft.com/office/drawing/2016/ink" xmlns:am3d="http://schemas.microsoft.com/office/drawing/2017/model3d" xmlns:o="urn:schemas-microsoft-com:office:office" xmlns:oel="http://schemas.microsoft.com/office/2019/extlst" xmlns:r="http://schemas.openxmlformats.org/officeDocument/2006/relationships" xmlns:m="http://schemas.openxmlformats.org/officeDocument/2006/math" xmlns:v="urn:schemas-microsoft-com:vml" xmlns:wp14="http://schemas.microsoft.com/office/word/2010/wordprocessingDrawing" xmlns:wp="http://schemas.openxmlformats.org/drawingml/2006/wordprocessingDrawing" xmlns:w10="urn:schemas-microsoft-com:office:word" xmlns:w="http://schemas.openxmlformats.org/wordprocessingml/2006/main" xmlns:w14="http://schemas.microsoft.com/office/word/2010/wordml" xmlns:w15="http://schemas.microsoft.com/office/word/2012/wordml" xmlns:w16cex="http://schemas.microsoft.com/office/word/2018/wordml/cex" xmlns:w16cid="http://schemas.microsoft.com/office/word/2016/wordml/cid" xmlns:w16="http://schemas.microsoft.com/office/word/2018/wordml" xmlns:w16du="http://schemas.microsoft.com/office/word/2023/wordml/word16du" xmlns:w16sdtdh="http://schemas.microsoft.com/office/word/2020/wordml/sdtdatahash" xmlns:w16sdtfl="http://schemas.microsoft.com/office/word/2024/wordml/sdtformatlock" xmlns:w16se="http://schemas.microsoft.com/office/word/2015/wordml/symex" xmlns:wpg="http://schemas.microsoft.com/office/word/2010/wordprocessingGroup" xmlns:wpi="http://schemas.microsoft.com/office/word/2010/wordprocessingInk" xmlns:wne="http://schemas.microsoft.com/office/word/2006/wordml" xmlns:wps="http://schemas.microsoft.com/office/word/2010/wordprocessingShape" mc:Ignorable="w14 w15 w16se w16cid w16 w16cex w16sdtdh w16sdtfl w16du wp14">
+<w:hdr xmlns:wpc="http://schemas.microsoft.com/office/word/2010/wordprocessingCanvas" xmlns:cx="http://schemas.microsoft.com/office/drawing/2014/chartex" xmlns:cx1="http://schemas.microsoft.com/office/drawing/2015/9/8/chartex" xmlns:cx2="http://schemas.microsoft.com/office/drawing/2015/10/21/chartex" xmlns:cx3="http://schemas.microsoft.com/office/drawing/2016/5/9/chartex" xmlns:cx4="http://schemas.microsoft.com/office/drawing/2016/5/10/chartex" xmlns:cx5="http://schemas.microsoft.com/office/drawing/2016/5/11/chartex" xmlns:cx6="http://schemas.microsoft.com/office/drawing/2016/5/12/chartex" xmlns:cx7="http://schemas.microsoft.com/office/drawing/2016/5/13/chartex" xmlns:cx8="http://schemas.microsoft.com/office/drawing/2016/5/14/chartex" xmlns:mc="http://schemas.openxmlformats.org/markup-compatibility/2006" xmlns:aink="http://schemas.microsoft.com/office/drawing/2016/ink" xmlns:am3d="http://schemas.microsoft.com/office/drawing/2017/model3d" xmlns:o="urn:schemas-microsoft-com:office:office" xmlns:oel="http://schemas.microsoft.com/office/2019/extlst" xmlns:r="http://schemas.openxmlformats.org/officeDocument/2006/relationships" xmlns:m="http://schemas.openxmlformats.org/officeDocument/2006/math" xmlns:v="urn:schemas-microsoft-com:vml" xmlns:wp14="http://schemas.microsoft.com/office/word/2010/wordprocessingDrawing" xmlns:wp="http://schemas.openxmlformats.org/drawingml/2006/wordprocessingDrawing" xmlns:w10="urn:schemas-microsoft-com:office:word" xmlns:w="http://schemas.openxmlformats.org/wordprocessingml/2006/main" xmlns:w14="http://schemas.microsoft.com/office/word/2010/wordml" xmlns:w15="http://schemas.microsoft.com/office/word/2012/wordml" xmlns:w16cex="http://schemas.microsoft.com/office/word/2018/wordml/cex" xmlns:w16cid="http://schemas.microsoft.com/office/word/2016/wordml/cid" xmlns:w16="http://schemas.microsoft.com/office/word/2018/wordml" xmlns:w16sdtdh="http://schemas.microsoft.com/office/word/2020/wordml/sdtdatahash" xmlns:w16se="http://schemas.microsoft.com/office/word/2015/wordml/symex" xmlns:wpg="http://schemas.microsoft.com/office/word/2010/wordprocessingGroup" xmlns:wpi="http://schemas.microsoft.com/office/word/2010/wordprocessingInk" xmlns:wne="http://schemas.microsoft.com/office/word/2006/wordml" xmlns:wps="http://schemas.microsoft.com/office/word/2010/wordprocessingShape" mc:Ignorable="w14 w15 w16se w16cid w16 w16cex w16sdtdh wp14">
   <w:p>
     <w:pPr>
       <w:pStyle w:val="Header"/>
@@ -17775,7 +17877,7 @@
 </file>
 
 <file path=word/header4.xml><?xml version="1.0" encoding="utf-8"?>
-<w:hdr xmlns:wpc="http://schemas.microsoft.com/office/word/2010/wordprocessingCanvas" xmlns:cx="http://schemas.microsoft.com/office/drawing/2014/chartex" xmlns:cx1="http://schemas.microsoft.com/office/drawing/2015/9/8/chartex" xmlns:cx2="http://schemas.microsoft.com/office/drawing/2015/10/21/chartex" xmlns:cx3="http://schemas.microsoft.com/office/drawing/2016/5/9/chartex" xmlns:cx4="http://schemas.microsoft.com/office/drawing/2016/5/10/chartex" xmlns:cx5="http://schemas.microsoft.com/office/drawing/2016/5/11/chartex" xmlns:cx6="http://schemas.microsoft.com/office/drawing/2016/5/12/chartex" xmlns:cx7="http://schemas.microsoft.com/office/drawing/2016/5/13/chartex" xmlns:cx8="http://schemas.microsoft.com/office/drawing/2016/5/14/chartex" xmlns:mc="http://schemas.openxmlformats.org/markup-compatibility/2006" xmlns:aink="http://schemas.microsoft.com/office/drawing/2016/ink" xmlns:am3d="http://schemas.microsoft.com/office/drawing/2017/model3d" xmlns:o="urn:schemas-microsoft-com:office:office" xmlns:oel="http://schemas.microsoft.com/office/2019/extlst" xmlns:r="http://schemas.openxmlformats.org/officeDocument/2006/relationships" xmlns:m="http://schemas.openxmlformats.org/officeDocument/2006/math" xmlns:v="urn:schemas-microsoft-com:vml" xmlns:wp14="http://schemas.microsoft.com/office/word/2010/wordprocessingDrawing" xmlns:wp="http://schemas.openxmlformats.org/drawingml/2006/wordprocessingDrawing" xmlns:w10="urn:schemas-microsoft-com:office:word" xmlns:w="http://schemas.openxmlformats.org/wordprocessingml/2006/main" xmlns:w14="http://schemas.microsoft.com/office/word/2010/wordml" xmlns:w15="http://schemas.microsoft.com/office/word/2012/wordml" xmlns:w16cex="http://schemas.microsoft.com/office/word/2018/wordml/cex" xmlns:w16cid="http://schemas.microsoft.com/office/word/2016/wordml/cid" xmlns:w16="http://schemas.microsoft.com/office/word/2018/wordml" xmlns:w16du="http://schemas.microsoft.com/office/word/2023/wordml/word16du" xmlns:w16sdtdh="http://schemas.microsoft.com/office/word/2020/wordml/sdtdatahash" xmlns:w16sdtfl="http://schemas.microsoft.com/office/word/2024/wordml/sdtformatlock" xmlns:w16se="http://schemas.microsoft.com/office/word/2015/wordml/symex" xmlns:wpg="http://schemas.microsoft.com/office/word/2010/wordprocessingGroup" xmlns:wpi="http://schemas.microsoft.com/office/word/2010/wordprocessingInk" xmlns:wne="http://schemas.microsoft.com/office/word/2006/wordml" xmlns:wps="http://schemas.microsoft.com/office/word/2010/wordprocessingShape" mc:Ignorable="w14 w15 w16se w16cid w16 w16cex w16sdtdh w16sdtfl w16du wp14">
+<w:hdr xmlns:wpc="http://schemas.microsoft.com/office/word/2010/wordprocessingCanvas" xmlns:cx="http://schemas.microsoft.com/office/drawing/2014/chartex" xmlns:cx1="http://schemas.microsoft.com/office/drawing/2015/9/8/chartex" xmlns:cx2="http://schemas.microsoft.com/office/drawing/2015/10/21/chartex" xmlns:cx3="http://schemas.microsoft.com/office/drawing/2016/5/9/chartex" xmlns:cx4="http://schemas.microsoft.com/office/drawing/2016/5/10/chartex" xmlns:cx5="http://schemas.microsoft.com/office/drawing/2016/5/11/chartex" xmlns:cx6="http://schemas.microsoft.com/office/drawing/2016/5/12/chartex" xmlns:cx7="http://schemas.microsoft.com/office/drawing/2016/5/13/chartex" xmlns:cx8="http://schemas.microsoft.com/office/drawing/2016/5/14/chartex" xmlns:mc="http://schemas.openxmlformats.org/markup-compatibility/2006" xmlns:aink="http://schemas.microsoft.com/office/drawing/2016/ink" xmlns:am3d="http://schemas.microsoft.com/office/drawing/2017/model3d" xmlns:o="urn:schemas-microsoft-com:office:office" xmlns:oel="http://schemas.microsoft.com/office/2019/extlst" xmlns:r="http://schemas.openxmlformats.org/officeDocument/2006/relationships" xmlns:m="http://schemas.openxmlformats.org/officeDocument/2006/math" xmlns:v="urn:schemas-microsoft-com:vml" xmlns:wp14="http://schemas.microsoft.com/office/word/2010/wordprocessingDrawing" xmlns:wp="http://schemas.openxmlformats.org/drawingml/2006/wordprocessingDrawing" xmlns:w10="urn:schemas-microsoft-com:office:word" xmlns:w="http://schemas.openxmlformats.org/wordprocessingml/2006/main" xmlns:w14="http://schemas.microsoft.com/office/word/2010/wordml" xmlns:w15="http://schemas.microsoft.com/office/word/2012/wordml" xmlns:w16cex="http://schemas.microsoft.com/office/word/2018/wordml/cex" xmlns:w16cid="http://schemas.microsoft.com/office/word/2016/wordml/cid" xmlns:w16="http://schemas.microsoft.com/office/word/2018/wordml" xmlns:w16sdtdh="http://schemas.microsoft.com/office/word/2020/wordml/sdtdatahash" xmlns:w16se="http://schemas.microsoft.com/office/word/2015/wordml/symex" xmlns:wpg="http://schemas.microsoft.com/office/word/2010/wordprocessingGroup" xmlns:wpi="http://schemas.microsoft.com/office/word/2010/wordprocessingInk" xmlns:wne="http://schemas.microsoft.com/office/word/2006/wordml" xmlns:wps="http://schemas.microsoft.com/office/word/2010/wordprocessingShape" mc:Ignorable="w14 w15 w16se w16cid w16 w16cex w16sdtdh wp14">
   <w:p>
     <w:pPr>
       <w:pStyle w:val="Header"/>
@@ -17800,7 +17902,7 @@
 </file>
 
 <file path=word/header5.xml><?xml version="1.0" encoding="utf-8"?>
-<w:hdr xmlns:wpc="http://schemas.microsoft.com/office/word/2010/wordprocessingCanvas" xmlns:cx="http://schemas.microsoft.com/office/drawing/2014/chartex" xmlns:cx1="http://schemas.microsoft.com/office/drawing/2015/9/8/chartex" xmlns:cx2="http://schemas.microsoft.com/office/drawing/2015/10/21/chartex" xmlns:cx3="http://schemas.microsoft.com/office/drawing/2016/5/9/chartex" xmlns:cx4="http://schemas.microsoft.com/office/drawing/2016/5/10/chartex" xmlns:cx5="http://schemas.microsoft.com/office/drawing/2016/5/11/chartex" xmlns:cx6="http://schemas.microsoft.com/office/drawing/2016/5/12/chartex" xmlns:cx7="http://schemas.microsoft.com/office/drawing/2016/5/13/chartex" xmlns:cx8="http://schemas.microsoft.com/office/drawing/2016/5/14/chartex" xmlns:mc="http://schemas.openxmlformats.org/markup-compatibility/2006" xmlns:aink="http://schemas.microsoft.com/office/drawing/2016/ink" xmlns:am3d="http://schemas.microsoft.com/office/drawing/2017/model3d" xmlns:o="urn:schemas-microsoft-com:office:office" xmlns:oel="http://schemas.microsoft.com/office/2019/extlst" xmlns:r="http://schemas.openxmlformats.org/officeDocument/2006/relationships" xmlns:m="http://schemas.openxmlformats.org/officeDocument/2006/math" xmlns:v="urn:schemas-microsoft-com:vml" xmlns:wp14="http://schemas.microsoft.com/office/word/2010/wordprocessingDrawing" xmlns:wp="http://schemas.openxmlformats.org/drawingml/2006/wordprocessingDrawing" xmlns:w10="urn:schemas-microsoft-com:office:word" xmlns:w="http://schemas.openxmlformats.org/wordprocessingml/2006/main" xmlns:w14="http://schemas.microsoft.com/office/word/2010/wordml" xmlns:w15="http://schemas.microsoft.com/office/word/2012/wordml" xmlns:w16cex="http://schemas.microsoft.com/office/word/2018/wordml/cex" xmlns:w16cid="http://schemas.microsoft.com/office/word/2016/wordml/cid" xmlns:w16="http://schemas.microsoft.com/office/word/2018/wordml" xmlns:w16du="http://schemas.microsoft.com/office/word/2023/wordml/word16du" xmlns:w16sdtdh="http://schemas.microsoft.com/office/word/2020/wordml/sdtdatahash" xmlns:w16sdtfl="http://schemas.microsoft.com/office/word/2024/wordml/sdtformatlock" xmlns:w16se="http://schemas.microsoft.com/office/word/2015/wordml/symex" xmlns:wpg="http://schemas.microsoft.com/office/word/2010/wordprocessingGroup" xmlns:wpi="http://schemas.microsoft.com/office/word/2010/wordprocessingInk" xmlns:wne="http://schemas.microsoft.com/office/word/2006/wordml" xmlns:wps="http://schemas.microsoft.com/office/word/2010/wordprocessingShape" mc:Ignorable="w14 w15 w16se w16cid w16 w16cex w16sdtdh w16sdtfl w16du wp14">
+<w:hdr xmlns:wpc="http://schemas.microsoft.com/office/word/2010/wordprocessingCanvas" xmlns:cx="http://schemas.microsoft.com/office/drawing/2014/chartex" xmlns:cx1="http://schemas.microsoft.com/office/drawing/2015/9/8/chartex" xmlns:cx2="http://schemas.microsoft.com/office/drawing/2015/10/21/chartex" xmlns:cx3="http://schemas.microsoft.com/office/drawing/2016/5/9/chartex" xmlns:cx4="http://schemas.microsoft.com/office/drawing/2016/5/10/chartex" xmlns:cx5="http://schemas.microsoft.com/office/drawing/2016/5/11/chartex" xmlns:cx6="http://schemas.microsoft.com/office/drawing/2016/5/12/chartex" xmlns:cx7="http://schemas.microsoft.com/office/drawing/2016/5/13/chartex" xmlns:cx8="http://schemas.microsoft.com/office/drawing/2016/5/14/chartex" xmlns:mc="http://schemas.openxmlformats.org/markup-compatibility/2006" xmlns:aink="http://schemas.microsoft.com/office/drawing/2016/ink" xmlns:am3d="http://schemas.microsoft.com/office/drawing/2017/model3d" xmlns:o="urn:schemas-microsoft-com:office:office" xmlns:oel="http://schemas.microsoft.com/office/2019/extlst" xmlns:r="http://schemas.openxmlformats.org/officeDocument/2006/relationships" xmlns:m="http://schemas.openxmlformats.org/officeDocument/2006/math" xmlns:v="urn:schemas-microsoft-com:vml" xmlns:wp14="http://schemas.microsoft.com/office/word/2010/wordprocessingDrawing" xmlns:wp="http://schemas.openxmlformats.org/drawingml/2006/wordprocessingDrawing" xmlns:w10="urn:schemas-microsoft-com:office:word" xmlns:w="http://schemas.openxmlformats.org/wordprocessingml/2006/main" xmlns:w14="http://schemas.microsoft.com/office/word/2010/wordml" xmlns:w15="http://schemas.microsoft.com/office/word/2012/wordml" xmlns:w16cex="http://schemas.microsoft.com/office/word/2018/wordml/cex" xmlns:w16cid="http://schemas.microsoft.com/office/word/2016/wordml/cid" xmlns:w16="http://schemas.microsoft.com/office/word/2018/wordml" xmlns:w16sdtdh="http://schemas.microsoft.com/office/word/2020/wordml/sdtdatahash" xmlns:w16se="http://schemas.microsoft.com/office/word/2015/wordml/symex" xmlns:wpg="http://schemas.microsoft.com/office/word/2010/wordprocessingGroup" xmlns:wpi="http://schemas.microsoft.com/office/word/2010/wordprocessingInk" xmlns:wne="http://schemas.microsoft.com/office/word/2006/wordml" xmlns:wps="http://schemas.microsoft.com/office/word/2010/wordprocessingShape" mc:Ignorable="w14 w15 w16se w16cid w16 w16cex w16sdtdh wp14">
   <w:p>
     <w:pPr>
       <w:pStyle w:val="Header"/>
@@ -17847,7 +17949,7 @@
 </file>
 
 <file path=word/header6.xml><?xml version="1.0" encoding="utf-8"?>
-<w:hdr xmlns:wpc="http://schemas.microsoft.com/office/word/2010/wordprocessingCanvas" xmlns:cx="http://schemas.microsoft.com/office/drawing/2014/chartex" xmlns:cx1="http://schemas.microsoft.com/office/drawing/2015/9/8/chartex" xmlns:cx2="http://schemas.microsoft.com/office/drawing/2015/10/21/chartex" xmlns:cx3="http://schemas.microsoft.com/office/drawing/2016/5/9/chartex" xmlns:cx4="http://schemas.microsoft.com/office/drawing/2016/5/10/chartex" xmlns:cx5="http://schemas.microsoft.com/office/drawing/2016/5/11/chartex" xmlns:cx6="http://schemas.microsoft.com/office/drawing/2016/5/12/chartex" xmlns:cx7="http://schemas.microsoft.com/office/drawing/2016/5/13/chartex" xmlns:cx8="http://schemas.microsoft.com/office/drawing/2016/5/14/chartex" xmlns:mc="http://schemas.openxmlformats.org/markup-compatibility/2006" xmlns:aink="http://schemas.microsoft.com/office/drawing/2016/ink" xmlns:am3d="http://schemas.microsoft.com/office/drawing/2017/model3d" xmlns:o="urn:schemas-microsoft-com:office:office" xmlns:oel="http://schemas.microsoft.com/office/2019/extlst" xmlns:r="http://schemas.openxmlformats.org/officeDocument/2006/relationships" xmlns:m="http://schemas.openxmlformats.org/officeDocument/2006/math" xmlns:v="urn:schemas-microsoft-com:vml" xmlns:wp14="http://schemas.microsoft.com/office/word/2010/wordprocessingDrawing" xmlns:wp="http://schemas.openxmlformats.org/drawingml/2006/wordprocessingDrawing" xmlns:w10="urn:schemas-microsoft-com:office:word" xmlns:w="http://schemas.openxmlformats.org/wordprocessingml/2006/main" xmlns:w14="http://schemas.microsoft.com/office/word/2010/wordml" xmlns:w15="http://schemas.microsoft.com/office/word/2012/wordml" xmlns:w16cex="http://schemas.microsoft.com/office/word/2018/wordml/cex" xmlns:w16cid="http://schemas.microsoft.com/office/word/2016/wordml/cid" xmlns:w16="http://schemas.microsoft.com/office/word/2018/wordml" xmlns:w16du="http://schemas.microsoft.com/office/word/2023/wordml/word16du" xmlns:w16sdtdh="http://schemas.microsoft.com/office/word/2020/wordml/sdtdatahash" xmlns:w16sdtfl="http://schemas.microsoft.com/office/word/2024/wordml/sdtformatlock" xmlns:w16se="http://schemas.microsoft.com/office/word/2015/wordml/symex" xmlns:wpg="http://schemas.microsoft.com/office/word/2010/wordprocessingGroup" xmlns:wpi="http://schemas.microsoft.com/office/word/2010/wordprocessingInk" xmlns:wne="http://schemas.microsoft.com/office/word/2006/wordml" xmlns:wps="http://schemas.microsoft.com/office/word/2010/wordprocessingShape" mc:Ignorable="w14 w15 w16se w16cid w16 w16cex w16sdtdh w16sdtfl w16du wp14">
+<w:hdr xmlns:wpc="http://schemas.microsoft.com/office/word/2010/wordprocessingCanvas" xmlns:cx="http://schemas.microsoft.com/office/drawing/2014/chartex" xmlns:cx1="http://schemas.microsoft.com/office/drawing/2015/9/8/chartex" xmlns:cx2="http://schemas.microsoft.com/office/drawing/2015/10/21/chartex" xmlns:cx3="http://schemas.microsoft.com/office/drawing/2016/5/9/chartex" xmlns:cx4="http://schemas.microsoft.com/office/drawing/2016/5/10/chartex" xmlns:cx5="http://schemas.microsoft.com/office/drawing/2016/5/11/chartex" xmlns:cx6="http://schemas.microsoft.com/office/drawing/2016/5/12/chartex" xmlns:cx7="http://schemas.microsoft.com/office/drawing/2016/5/13/chartex" xmlns:cx8="http://schemas.microsoft.com/office/drawing/2016/5/14/chartex" xmlns:mc="http://schemas.openxmlformats.org/markup-compatibility/2006" xmlns:aink="http://schemas.microsoft.com/office/drawing/2016/ink" xmlns:am3d="http://schemas.microsoft.com/office/drawing/2017/model3d" xmlns:o="urn:schemas-microsoft-com:office:office" xmlns:oel="http://schemas.microsoft.com/office/2019/extlst" xmlns:r="http://schemas.openxmlformats.org/officeDocument/2006/relationships" xmlns:m="http://schemas.openxmlformats.org/officeDocument/2006/math" xmlns:v="urn:schemas-microsoft-com:vml" xmlns:wp14="http://schemas.microsoft.com/office/word/2010/wordprocessingDrawing" xmlns:wp="http://schemas.openxmlformats.org/drawingml/2006/wordprocessingDrawing" xmlns:w10="urn:schemas-microsoft-com:office:word" xmlns:w="http://schemas.openxmlformats.org/wordprocessingml/2006/main" xmlns:w14="http://schemas.microsoft.com/office/word/2010/wordml" xmlns:w15="http://schemas.microsoft.com/office/word/2012/wordml" xmlns:w16cex="http://schemas.microsoft.com/office/word/2018/wordml/cex" xmlns:w16cid="http://schemas.microsoft.com/office/word/2016/wordml/cid" xmlns:w16="http://schemas.microsoft.com/office/word/2018/wordml" xmlns:w16sdtdh="http://schemas.microsoft.com/office/word/2020/wordml/sdtdatahash" xmlns:w16se="http://schemas.microsoft.com/office/word/2015/wordml/symex" xmlns:wpg="http://schemas.microsoft.com/office/word/2010/wordprocessingGroup" xmlns:wpi="http://schemas.microsoft.com/office/word/2010/wordprocessingInk" xmlns:wne="http://schemas.microsoft.com/office/word/2006/wordml" xmlns:wps="http://schemas.microsoft.com/office/word/2010/wordprocessingShape" mc:Ignorable="w14 w15 w16se w16cid w16 w16cex w16sdtdh wp14">
   <w:p>
     <w:pPr>
       <w:pStyle w:val="Header"/>
@@ -17857,7 +17959,7 @@
 </file>
 
 <file path=word/numbering.xml><?xml version="1.0" encoding="utf-8"?>
-<w:numbering xmlns:wpc="http://schemas.microsoft.com/office/word/2010/wordprocessingCanvas" xmlns:cx="http://schemas.microsoft.com/office/drawing/2014/chartex" xmlns:cx1="http://schemas.microsoft.com/office/drawing/2015/9/8/chartex" xmlns:cx2="http://schemas.microsoft.com/office/drawing/2015/10/21/chartex" xmlns:cx3="http://schemas.microsoft.com/office/drawing/2016/5/9/chartex" xmlns:cx4="http://schemas.microsoft.com/office/drawing/2016/5/10/chartex" xmlns:cx5="http://schemas.microsoft.com/office/drawing/2016/5/11/chartex" xmlns:cx6="http://schemas.microsoft.com/office/drawing/2016/5/12/chartex" xmlns:cx7="http://schemas.microsoft.com/office/drawing/2016/5/13/chartex" xmlns:cx8="http://schemas.microsoft.com/office/drawing/2016/5/14/chartex" xmlns:mc="http://schemas.openxmlformats.org/markup-compatibility/2006" xmlns:aink="http://schemas.microsoft.com/office/drawing/2016/ink" xmlns:am3d="http://schemas.microsoft.com/office/drawing/2017/model3d" xmlns:o="urn:schemas-microsoft-com:office:office" xmlns:oel="http://schemas.microsoft.com/office/2019/extlst" xmlns:r="http://schemas.openxmlformats.org/officeDocument/2006/relationships" xmlns:m="http://schemas.openxmlformats.org/officeDocument/2006/math" xmlns:v="urn:schemas-microsoft-com:vml" xmlns:wp14="http://schemas.microsoft.com/office/word/2010/wordprocessingDrawing" xmlns:wp="http://schemas.openxmlformats.org/drawingml/2006/wordprocessingDrawing" xmlns:w10="urn:schemas-microsoft-com:office:word" xmlns:w="http://schemas.openxmlformats.org/wordprocessingml/2006/main" xmlns:w14="http://schemas.microsoft.com/office/word/2010/wordml" xmlns:w15="http://schemas.microsoft.com/office/word/2012/wordml" xmlns:w16cex="http://schemas.microsoft.com/office/word/2018/wordml/cex" xmlns:w16cid="http://schemas.microsoft.com/office/word/2016/wordml/cid" xmlns:w16="http://schemas.microsoft.com/office/word/2018/wordml" xmlns:w16du="http://schemas.microsoft.com/office/word/2023/wordml/word16du" xmlns:w16sdtdh="http://schemas.microsoft.com/office/word/2020/wordml/sdtdatahash" xmlns:w16sdtfl="http://schemas.microsoft.com/office/word/2024/wordml/sdtformatlock" xmlns:w16se="http://schemas.microsoft.com/office/word/2015/wordml/symex" xmlns:wpg="http://schemas.microsoft.com/office/word/2010/wordprocessingGroup" xmlns:wpi="http://schemas.microsoft.com/office/word/2010/wordprocessingInk" xmlns:wne="http://schemas.microsoft.com/office/word/2006/wordml" xmlns:wps="http://schemas.microsoft.com/office/word/2010/wordprocessingShape" mc:Ignorable="w14 w15 w16se w16cid w16 w16cex w16sdtdh w16sdtfl w16du wp14">
+<w:numbering xmlns:wpc="http://schemas.microsoft.com/office/word/2010/wordprocessingCanvas" xmlns:cx="http://schemas.microsoft.com/office/drawing/2014/chartex" xmlns:cx1="http://schemas.microsoft.com/office/drawing/2015/9/8/chartex" xmlns:cx2="http://schemas.microsoft.com/office/drawing/2015/10/21/chartex" xmlns:cx3="http://schemas.microsoft.com/office/drawing/2016/5/9/chartex" xmlns:cx4="http://schemas.microsoft.com/office/drawing/2016/5/10/chartex" xmlns:cx5="http://schemas.microsoft.com/office/drawing/2016/5/11/chartex" xmlns:cx6="http://schemas.microsoft.com/office/drawing/2016/5/12/chartex" xmlns:cx7="http://schemas.microsoft.com/office/drawing/2016/5/13/chartex" xmlns:cx8="http://schemas.microsoft.com/office/drawing/2016/5/14/chartex" xmlns:mc="http://schemas.openxmlformats.org/markup-compatibility/2006" xmlns:aink="http://schemas.microsoft.com/office/drawing/2016/ink" xmlns:am3d="http://schemas.microsoft.com/office/drawing/2017/model3d" xmlns:o="urn:schemas-microsoft-com:office:office" xmlns:oel="http://schemas.microsoft.com/office/2019/extlst" xmlns:r="http://schemas.openxmlformats.org/officeDocument/2006/relationships" xmlns:m="http://schemas.openxmlformats.org/officeDocument/2006/math" xmlns:v="urn:schemas-microsoft-com:vml" xmlns:wp14="http://schemas.microsoft.com/office/word/2010/wordprocessingDrawing" xmlns:wp="http://schemas.openxmlformats.org/drawingml/2006/wordprocessingDrawing" xmlns:w10="urn:schemas-microsoft-com:office:word" xmlns:w="http://schemas.openxmlformats.org/wordprocessingml/2006/main" xmlns:w14="http://schemas.microsoft.com/office/word/2010/wordml" xmlns:w15="http://schemas.microsoft.com/office/word/2012/wordml" xmlns:w16cex="http://schemas.microsoft.com/office/word/2018/wordml/cex" xmlns:w16cid="http://schemas.microsoft.com/office/word/2016/wordml/cid" xmlns:w16="http://schemas.microsoft.com/office/word/2018/wordml" xmlns:w16sdtdh="http://schemas.microsoft.com/office/word/2020/wordml/sdtdatahash" xmlns:w16se="http://schemas.microsoft.com/office/word/2015/wordml/symex" xmlns:wpg="http://schemas.microsoft.com/office/word/2010/wordprocessingGroup" xmlns:wpi="http://schemas.microsoft.com/office/word/2010/wordprocessingInk" xmlns:wne="http://schemas.microsoft.com/office/word/2006/wordml" xmlns:wps="http://schemas.microsoft.com/office/word/2010/wordprocessingShape" mc:Ignorable="w14 w15 w16se w16cid w16 w16cex w16sdtdh wp14">
   <w:abstractNum w:abstractNumId="0" w15:restartNumberingAfterBreak="0">
     <w:nsid w:val="02D839C4"/>
     <w:multiLevelType w:val="multilevel"/>
@@ -18919,7 +19021,7 @@
 </file>
 
 <file path=word/styles.xml><?xml version="1.0" encoding="utf-8"?>
-<w:styles xmlns:mc="http://schemas.openxmlformats.org/markup-compatibility/2006" xmlns:r="http://schemas.openxmlformats.org/officeDocument/2006/relationships" xmlns:w="http://schemas.openxmlformats.org/wordprocessingml/2006/main" xmlns:w14="http://schemas.microsoft.com/office/word/2010/wordml" xmlns:w15="http://schemas.microsoft.com/office/word/2012/wordml" xmlns:w16cex="http://schemas.microsoft.com/office/word/2018/wordml/cex" xmlns:w16cid="http://schemas.microsoft.com/office/word/2016/wordml/cid" xmlns:w16="http://schemas.microsoft.com/office/word/2018/wordml" xmlns:w16du="http://schemas.microsoft.com/office/word/2023/wordml/word16du" xmlns:w16sdtdh="http://schemas.microsoft.com/office/word/2020/wordml/sdtdatahash" xmlns:w16sdtfl="http://schemas.microsoft.com/office/word/2024/wordml/sdtformatlock" xmlns:w16se="http://schemas.microsoft.com/office/word/2015/wordml/symex" mc:Ignorable="w14 w15 w16se w16cid w16 w16cex w16sdtdh w16sdtfl w16du">
+<w:styles xmlns:mc="http://schemas.openxmlformats.org/markup-compatibility/2006" xmlns:r="http://schemas.openxmlformats.org/officeDocument/2006/relationships" xmlns:w="http://schemas.openxmlformats.org/wordprocessingml/2006/main" xmlns:w14="http://schemas.microsoft.com/office/word/2010/wordml" xmlns:w15="http://schemas.microsoft.com/office/word/2012/wordml" xmlns:w16cex="http://schemas.microsoft.com/office/word/2018/wordml/cex" xmlns:w16cid="http://schemas.microsoft.com/office/word/2016/wordml/cid" xmlns:w16="http://schemas.microsoft.com/office/word/2018/wordml" xmlns:w16sdtdh="http://schemas.microsoft.com/office/word/2020/wordml/sdtdatahash" xmlns:w16se="http://schemas.microsoft.com/office/word/2015/wordml/symex" mc:Ignorable="w14 w15 w16se w16cid w16 w16cex w16sdtdh">
   <w:docDefaults>
     <w:rPrDefault>
       <w:rPr>
@@ -20441,6 +20543,24 @@
       <w:lang w:eastAsia="ru-RU"/>
     </w:rPr>
   </w:style>
+  <w:style w:type="paragraph" w:styleId="Caption">
+    <w:name w:val="caption"/>
+    <w:basedOn w:val="Normal"/>
+    <w:next w:val="Normal"/>
+    <w:unhideWhenUsed/>
+    <w:qFormat/>
+    <w:rsid w:val="000A7EA8"/>
+    <w:pPr>
+      <w:spacing w:after="200" w:line="240" w:lineRule="auto"/>
+    </w:pPr>
+    <w:rPr>
+      <w:i/>
+      <w:iCs/>
+      <w:color w:val="44546A" w:themeColor="text2"/>
+      <w:sz w:val="18"/>
+      <w:szCs w:val="18"/>
+    </w:rPr>
+  </w:style>
 </w:styles>
 </file>
 
@@ -20740,10 +20860,6 @@
 </file>
 
 <file path=customXml/item1.xml><?xml version="1.0" encoding="utf-8"?>
-<b:Sources xmlns:b="http://schemas.openxmlformats.org/officeDocument/2006/bibliography" xmlns="http://schemas.openxmlformats.org/officeDocument/2006/bibliography" SelectedStyle="\APA.XSL" StyleName="APA"/>
-</file>
-
-<file path=customXml/item2.xml><?xml version="1.0" encoding="utf-8"?>
 <?mso-contentType ?>
 <FormTemplates xmlns="http://schemas.microsoft.com/sharepoint/v3/contenttype/forms">
   <Display>DocumentLibraryForm</Display>
@@ -20752,7 +20868,22 @@
 </FormTemplates>
 </file>
 
+<file path=customXml/item2.xml><?xml version="1.0" encoding="utf-8"?>
+<b:Sources xmlns:b="http://schemas.openxmlformats.org/officeDocument/2006/bibliography" xmlns="http://schemas.openxmlformats.org/officeDocument/2006/bibliography" SelectedStyle="\APA.XSL" StyleName="APA"/>
+</file>
+
 <file path=customXml/item3.xml><?xml version="1.0" encoding="utf-8"?>
+<p:properties xmlns:p="http://schemas.microsoft.com/office/2006/metadata/properties" xmlns:xsi="http://www.w3.org/2001/XMLSchema-instance" xmlns:pc="http://schemas.microsoft.com/office/infopath/2007/PartnerControls">
+  <documentManagement>
+    <lcf76f155ced4ddcb4097134ff3c332f xmlns="a4d5d7a1-e616-4859-89a0-6c64dde171e6">
+      <Terms xmlns="http://schemas.microsoft.com/office/infopath/2007/PartnerControls"/>
+    </lcf76f155ced4ddcb4097134ff3c332f>
+    <TaxCatchAll xmlns="dd745e8d-a748-488f-bc05-96effed62907" xsi:nil="true"/>
+  </documentManagement>
+</p:properties>
+</file>
+
+<file path=customXml/item4.xml><?xml version="1.0" encoding="utf-8"?>
 <ct:contentTypeSchema xmlns:ct="http://schemas.microsoft.com/office/2006/metadata/contentType" xmlns:ma="http://schemas.microsoft.com/office/2006/metadata/properties/metaAttributes" ct:_="" ma:_="" ma:contentTypeName="Документ" ma:contentTypeID="0x010100C59E7F3697A66E4AB7013F0382A2AA1F" ma:contentTypeVersion="18" ma:contentTypeDescription="Створення нового документа." ma:contentTypeScope="" ma:versionID="fcfe6e6b140a721e9bf1f6680f3b14ab">
   <xsd:schema xmlns:xsd="http://www.w3.org/2001/XMLSchema" xmlns:xs="http://www.w3.org/2001/XMLSchema" xmlns:p="http://schemas.microsoft.com/office/2006/metadata/properties" xmlns:ns2="a4d5d7a1-e616-4859-89a0-6c64dde171e6" xmlns:ns3="dd745e8d-a748-488f-bc05-96effed62907" targetNamespace="http://schemas.microsoft.com/office/2006/metadata/properties" ma:root="true" ma:fieldsID="b8da16690c485624a14f221ebb22d7e3" ns2:_="" ns3:_="">
     <xsd:import namespace="a4d5d7a1-e616-4859-89a0-6c64dde171e6"/>
@@ -21007,18 +21138,15 @@
 </ct:contentTypeSchema>
 </file>
 
-<file path=customXml/item4.xml><?xml version="1.0" encoding="utf-8"?>
-<p:properties xmlns:p="http://schemas.microsoft.com/office/2006/metadata/properties" xmlns:xsi="http://www.w3.org/2001/XMLSchema-instance" xmlns:pc="http://schemas.microsoft.com/office/infopath/2007/PartnerControls">
-  <documentManagement>
-    <lcf76f155ced4ddcb4097134ff3c332f xmlns="a4d5d7a1-e616-4859-89a0-6c64dde171e6">
-      <Terms xmlns="http://schemas.microsoft.com/office/infopath/2007/PartnerControls"/>
-    </lcf76f155ced4ddcb4097134ff3c332f>
-    <TaxCatchAll xmlns="dd745e8d-a748-488f-bc05-96effed62907" xsi:nil="true"/>
-  </documentManagement>
-</p:properties>
+<file path=customXml/itemProps1.xml><?xml version="1.0" encoding="utf-8"?>
+<ds:datastoreItem xmlns:ds="http://schemas.openxmlformats.org/officeDocument/2006/customXml" ds:itemID="{C2C1AEBF-B89B-40CA-8A81-1930E0A98EBF}">
+  <ds:schemaRefs>
+    <ds:schemaRef ds:uri="http://schemas.microsoft.com/sharepoint/v3/contenttype/forms"/>
+  </ds:schemaRefs>
+</ds:datastoreItem>
 </file>
 
-<file path=customXml/itemProps1.xml><?xml version="1.0" encoding="utf-8"?>
+<file path=customXml/itemProps2.xml><?xml version="1.0" encoding="utf-8"?>
 <ds:datastoreItem xmlns:ds="http://schemas.openxmlformats.org/officeDocument/2006/customXml" ds:itemID="{DB703D8C-9131-4F37-8E21-5D00AF2DE17E}">
   <ds:schemaRefs>
     <ds:schemaRef ds:uri="http://schemas.openxmlformats.org/officeDocument/2006/bibliography"/>
@@ -21026,15 +21154,18 @@
 </ds:datastoreItem>
 </file>
 
-<file path=customXml/itemProps2.xml><?xml version="1.0" encoding="utf-8"?>
-<ds:datastoreItem xmlns:ds="http://schemas.openxmlformats.org/officeDocument/2006/customXml" ds:itemID="{C2C1AEBF-B89B-40CA-8A81-1930E0A98EBF}">
+<file path=customXml/itemProps3.xml><?xml version="1.0" encoding="utf-8"?>
+<ds:datastoreItem xmlns:ds="http://schemas.openxmlformats.org/officeDocument/2006/customXml" ds:itemID="{4B07A75D-AAFD-477E-8646-52AB72E65560}">
   <ds:schemaRefs>
-    <ds:schemaRef ds:uri="http://schemas.microsoft.com/sharepoint/v3/contenttype/forms"/>
+    <ds:schemaRef ds:uri="http://schemas.microsoft.com/office/2006/metadata/properties"/>
+    <ds:schemaRef ds:uri="http://schemas.microsoft.com/office/infopath/2007/PartnerControls"/>
+    <ds:schemaRef ds:uri="a4d5d7a1-e616-4859-89a0-6c64dde171e6"/>
+    <ds:schemaRef ds:uri="dd745e8d-a748-488f-bc05-96effed62907"/>
   </ds:schemaRefs>
 </ds:datastoreItem>
 </file>
 
-<file path=customXml/itemProps3.xml><?xml version="1.0" encoding="utf-8"?>
+<file path=customXml/itemProps4.xml><?xml version="1.0" encoding="utf-8"?>
 <ds:datastoreItem xmlns:ds="http://schemas.openxmlformats.org/officeDocument/2006/customXml" ds:itemID="{E7F82B6F-AF2B-46AA-994F-B5FC1F6ED4E0}">
   <ds:schemaRefs>
     <ds:schemaRef ds:uri="http://schemas.microsoft.com/office/2006/metadata/contentType"/>
@@ -21051,15 +21182,4 @@
     <ds:schemaRef ds:uri="http://schemas.microsoft.com/internal/obd"/>
   </ds:schemaRefs>
 </ds:datastoreItem>
-</file>
-
-<file path=customXml/itemProps4.xml><?xml version="1.0" encoding="utf-8"?>
-<ds:datastoreItem xmlns:ds="http://schemas.openxmlformats.org/officeDocument/2006/customXml" ds:itemID="{4B07A75D-AAFD-477E-8646-52AB72E65560}">
-  <ds:schemaRefs>
-    <ds:schemaRef ds:uri="http://schemas.microsoft.com/office/2006/metadata/properties"/>
-    <ds:schemaRef ds:uri="http://schemas.microsoft.com/office/infopath/2007/PartnerControls"/>
-    <ds:schemaRef ds:uri="a4d5d7a1-e616-4859-89a0-6c64dde171e6"/>
-    <ds:schemaRef ds:uri="dd745e8d-a748-488f-bc05-96effed62907"/>
-  </ds:schemaRefs>
-</ds:datastoreItem>
 </file>
</xml_diff>